<commit_message>
Actualizacion completa del sistema de convalidaciones
</commit_message>
<xml_diff>
--- a/Carreras/Administración de Empresas/2.5 años/Formato.docx
+++ b/Carreras/Administración de Empresas/2.5 años/Formato.docx
@@ -4946,24 +4946,1582 @@
           </w:p>
         </w:tc>
       </w:tr>
+      <w:tr>
+        <w:trPr>
+          <w:trHeight w:val="366"/>
+        </w:trPr>
+        <w:tc>
+          <w:tcPr>
+            <w:tcW w:w="401" w:type="dxa"/>
+            <w:vMerge w:val="restart"/>
+            <w:tcBorders>
+              <w:top w:val="nil"/>
+            </w:tcBorders>
+          </w:tcPr>
+          <w:p>
+            <w:pPr>
+              <w:pStyle w:val="TableParagraph"/>
+              <w:jc w:val="left"/>
+              <w:rPr>
+                <w:rFonts w:ascii="Times New Roman"/>
+                <w:sz w:val="16"/>
+              </w:rPr>
+            </w:pPr>
+          </w:p>
+        </w:tc>
+        <w:tc>
+          <w:tcPr>
+            <w:tcW w:w="1303" w:type="dxa"/>
+            <w:vMerge w:val="restart"/>
+            <w:tcBorders>
+              <w:top w:val="nil"/>
+            </w:tcBorders>
+          </w:tcPr>
+          <w:p>
+            <w:pPr>
+              <w:pStyle w:val="TableParagraph"/>
+              <w:jc w:val="left"/>
+              <w:rPr>
+                <w:rFonts w:ascii="Times New Roman"/>
+                <w:sz w:val="16"/>
+              </w:rPr>
+            </w:pPr>
+          </w:p>
+        </w:tc>
+        <w:tc>
+          <w:tcPr>
+            <w:tcW w:w="2693" w:type="dxa"/>
+            <w:tcBorders>
+              <w:top w:val="nil"/>
+            </w:tcBorders>
+          </w:tcPr>
+          <w:p>
+            <w:pPr>
+              <w:pStyle w:val="TableParagraph"/>
+              <w:spacing w:line="182" w:lineRule="exact"/>
+              <w:ind w:left="69"/>
+              <w:jc w:val="left"/>
+              <w:rPr>
+                <w:sz w:val="16"/>
+              </w:rPr>
+            </w:pPr>
+            <w:r>
+              <w:rPr>
+                <w:sz w:val="16"/>
+              </w:rPr>
+              <w:t>FUNDAMENTOS</w:t>
+            </w:r>
+            <w:r>
+              <w:rPr>
+                <w:spacing w:val="-12"/>
+                <w:sz w:val="16"/>
+              </w:rPr>
+              <w:t xml:space="preserve"> </w:t>
+            </w:r>
+            <w:r>
+              <w:rPr>
+                <w:sz w:val="16"/>
+              </w:rPr>
+              <w:t>DE</w:t>
+            </w:r>
+            <w:r>
+              <w:rPr>
+                <w:spacing w:val="-11"/>
+                <w:sz w:val="16"/>
+              </w:rPr>
+              <w:t xml:space="preserve"> </w:t>
+            </w:r>
+            <w:r>
+              <w:rPr>
+                <w:sz w:val="16"/>
+              </w:rPr>
+              <w:t xml:space="preserve">LA </w:t>
+            </w:r>
+            <w:r>
+              <w:rPr>
+                <w:spacing w:val="-2"/>
+                <w:sz w:val="16"/>
+              </w:rPr>
+              <w:t>ADMINISTRACIÓN</w:t>
+            </w:r>
+          </w:p>
+        </w:tc>
+        <w:tc>
+          <w:tcPr>
+            <w:tcW w:w="859" w:type="dxa"/>
+            <w:tcBorders>
+              <w:top w:val="nil"/>
+            </w:tcBorders>
+          </w:tcPr>
+          <w:p>
+            <w:pPr>
+              <w:pStyle w:val="TableParagraph"/>
+              <w:spacing w:before="92"/>
+              <w:ind w:left="13" w:right="4"/>
+              <w:rPr>
+                <w:sz w:val="16"/>
+              </w:rPr>
+            </w:pPr>
+            <w:r>
+              <w:rPr>
+                <w:spacing w:val="-10"/>
+                <w:sz w:val="16"/>
+              </w:rPr>
+              <w:t>3</w:t>
+            </w:r>
+          </w:p>
+        </w:tc>
+        <w:tc>
+          <w:tcPr>
+            <w:tcW w:w="657" w:type="dxa"/>
+            <w:tcBorders>
+              <w:top w:val="nil"/>
+            </w:tcBorders>
+          </w:tcPr>
+          <w:p>
+            <w:pPr>
+              <w:pStyle w:val="TableParagraph"/>
+              <w:jc w:val="left"/>
+              <w:rPr>
+                <w:rFonts w:ascii="Times New Roman"/>
+                <w:sz w:val="16"/>
+              </w:rPr>
+            </w:pPr>
+          </w:p>
+        </w:tc>
+        <w:tc>
+          <w:tcPr>
+            <w:tcW w:w="2309" w:type="dxa"/>
+            <w:tcBorders>
+              <w:top w:val="nil"/>
+            </w:tcBorders>
+          </w:tcPr>
+          <w:p>
+            <w:pPr>
+              <w:pStyle w:val="TableParagraph"/>
+              <w:jc w:val="left"/>
+              <w:rPr>
+                <w:rFonts w:ascii="Times New Roman"/>
+                <w:sz w:val="16"/>
+              </w:rPr>
+            </w:pPr>
+          </w:p>
+        </w:tc>
+        <w:tc>
+          <w:tcPr>
+            <w:tcW w:w="919" w:type="dxa"/>
+            <w:tcBorders>
+              <w:top w:val="nil"/>
+            </w:tcBorders>
+          </w:tcPr>
+          <w:p>
+            <w:pPr>
+              <w:pStyle w:val="TableParagraph"/>
+              <w:jc w:val="left"/>
+              <w:rPr>
+                <w:rFonts w:ascii="Times New Roman"/>
+                <w:sz w:val="16"/>
+              </w:rPr>
+            </w:pPr>
+          </w:p>
+        </w:tc>
+        <w:tc>
+          <w:tcPr>
+            <w:tcW w:w="1539" w:type="dxa"/>
+            <w:vMerge w:val="restart"/>
+            <w:tcBorders>
+              <w:top w:val="nil"/>
+            </w:tcBorders>
+          </w:tcPr>
+          <w:p>
+            <w:pPr>
+              <w:pStyle w:val="TableParagraph"/>
+              <w:jc w:val="left"/>
+              <w:rPr>
+                <w:rFonts w:ascii="Times New Roman"/>
+                <w:sz w:val="16"/>
+              </w:rPr>
+            </w:pPr>
+          </w:p>
+        </w:tc>
+      </w:tr>
+      <w:tr>
+        <w:trPr>
+          <w:trHeight w:val="225"/>
+        </w:trPr>
+        <w:tc>
+          <w:tcPr>
+            <w:tcW w:w="401" w:type="dxa"/>
+            <w:vMerge/>
+            <w:tcBorders>
+              <w:top w:val="nil"/>
+            </w:tcBorders>
+          </w:tcPr>
+          <w:p>
+            <w:pPr>
+              <w:rPr>
+                <w:sz w:val="2"/>
+                <w:szCs w:val="2"/>
+              </w:rPr>
+            </w:pPr>
+          </w:p>
+        </w:tc>
+        <w:tc>
+          <w:tcPr>
+            <w:tcW w:w="1303" w:type="dxa"/>
+            <w:vMerge/>
+            <w:tcBorders>
+              <w:top w:val="nil"/>
+            </w:tcBorders>
+          </w:tcPr>
+          <w:p>
+            <w:pPr>
+              <w:rPr>
+                <w:sz w:val="2"/>
+                <w:szCs w:val="2"/>
+              </w:rPr>
+            </w:pPr>
+          </w:p>
+        </w:tc>
+        <w:tc>
+          <w:tcPr>
+            <w:tcW w:w="2693" w:type="dxa"/>
+          </w:tcPr>
+          <w:p>
+            <w:pPr>
+              <w:pStyle w:val="TableParagraph"/>
+              <w:spacing w:before="22" w:line="183" w:lineRule="exact"/>
+              <w:ind w:left="69"/>
+              <w:jc w:val="left"/>
+              <w:rPr>
+                <w:sz w:val="16"/>
+              </w:rPr>
+            </w:pPr>
+            <w:r>
+              <w:rPr>
+                <w:sz w:val="16"/>
+              </w:rPr>
+              <w:t>GESTIÓN</w:t>
+            </w:r>
+            <w:r>
+              <w:rPr>
+                <w:spacing w:val="-6"/>
+                <w:sz w:val="16"/>
+              </w:rPr>
+              <w:t xml:space="preserve"> </w:t>
+            </w:r>
+            <w:r>
+              <w:rPr>
+                <w:spacing w:val="-2"/>
+                <w:sz w:val="16"/>
+              </w:rPr>
+              <w:t>ESTRATÉGICA</w:t>
+            </w:r>
+          </w:p>
+        </w:tc>
+        <w:tc>
+          <w:tcPr>
+            <w:tcW w:w="859" w:type="dxa"/>
+          </w:tcPr>
+          <w:p>
+            <w:pPr>
+              <w:pStyle w:val="TableParagraph"/>
+              <w:spacing w:before="22" w:line="183" w:lineRule="exact"/>
+              <w:ind w:left="13" w:right="4"/>
+              <w:rPr>
+                <w:sz w:val="16"/>
+              </w:rPr>
+            </w:pPr>
+            <w:r>
+              <w:rPr>
+                <w:spacing w:val="-10"/>
+                <w:sz w:val="16"/>
+              </w:rPr>
+              <w:t>4</w:t>
+            </w:r>
+          </w:p>
+        </w:tc>
+        <w:tc>
+          <w:tcPr>
+            <w:tcW w:w="657" w:type="dxa"/>
+          </w:tcPr>
+          <w:p>
+            <w:pPr>
+              <w:pStyle w:val="TableParagraph"/>
+              <w:jc w:val="left"/>
+              <w:rPr>
+                <w:rFonts w:ascii="Times New Roman"/>
+                <w:sz w:val="16"/>
+              </w:rPr>
+            </w:pPr>
+          </w:p>
+        </w:tc>
+        <w:tc>
+          <w:tcPr>
+            <w:tcW w:w="2309" w:type="dxa"/>
+          </w:tcPr>
+          <w:p>
+            <w:pPr>
+              <w:pStyle w:val="TableParagraph"/>
+              <w:jc w:val="left"/>
+              <w:rPr>
+                <w:rFonts w:ascii="Times New Roman"/>
+                <w:sz w:val="16"/>
+              </w:rPr>
+            </w:pPr>
+          </w:p>
+        </w:tc>
+        <w:tc>
+          <w:tcPr>
+            <w:tcW w:w="919" w:type="dxa"/>
+          </w:tcPr>
+          <w:p>
+            <w:pPr>
+              <w:pStyle w:val="TableParagraph"/>
+              <w:jc w:val="left"/>
+              <w:rPr>
+                <w:rFonts w:ascii="Times New Roman"/>
+                <w:sz w:val="16"/>
+              </w:rPr>
+            </w:pPr>
+          </w:p>
+        </w:tc>
+        <w:tc>
+          <w:tcPr>
+            <w:tcW w:w="1539" w:type="dxa"/>
+            <w:vMerge/>
+            <w:tcBorders>
+              <w:top w:val="nil"/>
+            </w:tcBorders>
+          </w:tcPr>
+          <w:p>
+            <w:pPr>
+              <w:rPr>
+                <w:sz w:val="2"/>
+                <w:szCs w:val="2"/>
+              </w:rPr>
+            </w:pPr>
+          </w:p>
+        </w:tc>
+      </w:tr>
+      <w:tr>
+        <w:trPr>
+          <w:trHeight w:val="450"/>
+        </w:trPr>
+        <w:tc>
+          <w:tcPr>
+            <w:tcW w:w="401" w:type="dxa"/>
+            <w:vMerge/>
+            <w:tcBorders>
+              <w:top w:val="nil"/>
+            </w:tcBorders>
+          </w:tcPr>
+          <w:p>
+            <w:pPr>
+              <w:rPr>
+                <w:sz w:val="2"/>
+                <w:szCs w:val="2"/>
+              </w:rPr>
+            </w:pPr>
+          </w:p>
+        </w:tc>
+        <w:tc>
+          <w:tcPr>
+            <w:tcW w:w="1303" w:type="dxa"/>
+            <w:vMerge w:val="restart"/>
+          </w:tcPr>
+          <w:p>
+            <w:pPr>
+              <w:pStyle w:val="TableParagraph"/>
+              <w:spacing w:before="9"/>
+              <w:jc w:val="left"/>
+              <w:rPr>
+                <w:rFonts w:ascii="Calibri Light"/>
+                <w:sz w:val="16"/>
+              </w:rPr>
+            </w:pPr>
+          </w:p>
+          <w:p>
+            <w:pPr>
+              <w:pStyle w:val="TableParagraph"/>
+              <w:ind w:left="81" w:right="69" w:hanging="1"/>
+              <w:rPr>
+                <w:sz w:val="16"/>
+              </w:rPr>
+            </w:pPr>
+            <w:r>
+              <w:rPr>
+                <w:spacing w:val="-2"/>
+                <w:sz w:val="16"/>
+              </w:rPr>
+              <w:t xml:space="preserve">Compromiso </w:t>
+            </w:r>
+            <w:r>
+              <w:rPr>
+                <w:sz w:val="16"/>
+              </w:rPr>
+              <w:t>con principios, valores y</w:t>
+            </w:r>
+            <w:r>
+              <w:rPr>
+                <w:spacing w:val="40"/>
+                <w:sz w:val="16"/>
+              </w:rPr>
+              <w:t xml:space="preserve"> </w:t>
+            </w:r>
+            <w:r>
+              <w:rPr>
+                <w:sz w:val="16"/>
+              </w:rPr>
+              <w:t>mejora</w:t>
+            </w:r>
+            <w:r>
+              <w:rPr>
+                <w:spacing w:val="-12"/>
+                <w:sz w:val="16"/>
+              </w:rPr>
+              <w:t xml:space="preserve"> </w:t>
+            </w:r>
+            <w:r>
+              <w:rPr>
+                <w:sz w:val="16"/>
+              </w:rPr>
+              <w:t>continua</w:t>
+            </w:r>
+          </w:p>
+        </w:tc>
+        <w:tc>
+          <w:tcPr>
+            <w:tcW w:w="2693" w:type="dxa"/>
+          </w:tcPr>
+          <w:p>
+            <w:pPr>
+              <w:pStyle w:val="TableParagraph"/>
+              <w:spacing w:before="41"/>
+              <w:ind w:left="69"/>
+              <w:jc w:val="left"/>
+              <w:rPr>
+                <w:sz w:val="16"/>
+              </w:rPr>
+            </w:pPr>
+            <w:r>
+              <w:rPr>
+                <w:sz w:val="16"/>
+              </w:rPr>
+              <w:t>DISEÑO</w:t>
+            </w:r>
+            <w:r>
+              <w:rPr>
+                <w:spacing w:val="-12"/>
+                <w:sz w:val="16"/>
+              </w:rPr>
+              <w:t xml:space="preserve"> </w:t>
+            </w:r>
+            <w:r>
+              <w:rPr>
+                <w:sz w:val="16"/>
+              </w:rPr>
+              <w:t>ORGANIZACIONAL</w:t>
+            </w:r>
+            <w:r>
+              <w:rPr>
+                <w:spacing w:val="-11"/>
+                <w:sz w:val="16"/>
+              </w:rPr>
+              <w:t xml:space="preserve"> </w:t>
+            </w:r>
+            <w:r>
+              <w:rPr>
+                <w:sz w:val="16"/>
+              </w:rPr>
+              <w:t>Y</w:t>
+            </w:r>
+            <w:r>
+              <w:rPr>
+                <w:spacing w:val="-11"/>
+                <w:sz w:val="16"/>
+              </w:rPr>
+              <w:t xml:space="preserve"> </w:t>
+            </w:r>
+            <w:r>
+              <w:rPr>
+                <w:sz w:val="16"/>
+              </w:rPr>
+              <w:t>DE PROCESOS I</w:t>
+            </w:r>
+          </w:p>
+        </w:tc>
+        <w:tc>
+          <w:tcPr>
+            <w:tcW w:w="859" w:type="dxa"/>
+          </w:tcPr>
+          <w:p>
+            <w:pPr>
+              <w:pStyle w:val="TableParagraph"/>
+              <w:spacing w:before="135"/>
+              <w:ind w:left="13" w:right="4"/>
+              <w:rPr>
+                <w:sz w:val="16"/>
+              </w:rPr>
+            </w:pPr>
+            <w:r>
+              <w:rPr>
+                <w:spacing w:val="-10"/>
+                <w:sz w:val="16"/>
+              </w:rPr>
+              <w:t>5</w:t>
+            </w:r>
+          </w:p>
+        </w:tc>
+        <w:tc>
+          <w:tcPr>
+            <w:tcW w:w="657" w:type="dxa"/>
+          </w:tcPr>
+          <w:p>
+            <w:pPr>
+              <w:pStyle w:val="TableParagraph"/>
+              <w:jc w:val="left"/>
+              <w:rPr>
+                <w:rFonts w:ascii="Times New Roman"/>
+                <w:sz w:val="16"/>
+              </w:rPr>
+            </w:pPr>
+          </w:p>
+        </w:tc>
+        <w:tc>
+          <w:tcPr>
+            <w:tcW w:w="2309" w:type="dxa"/>
+          </w:tcPr>
+          <w:p>
+            <w:pPr>
+              <w:pStyle w:val="TableParagraph"/>
+              <w:jc w:val="left"/>
+              <w:rPr>
+                <w:rFonts w:ascii="Times New Roman"/>
+                <w:sz w:val="16"/>
+              </w:rPr>
+            </w:pPr>
+          </w:p>
+        </w:tc>
+        <w:tc>
+          <w:tcPr>
+            <w:tcW w:w="919" w:type="dxa"/>
+          </w:tcPr>
+          <w:p>
+            <w:pPr>
+              <w:pStyle w:val="TableParagraph"/>
+              <w:jc w:val="left"/>
+              <w:rPr>
+                <w:rFonts w:ascii="Times New Roman"/>
+                <w:sz w:val="16"/>
+              </w:rPr>
+            </w:pPr>
+          </w:p>
+        </w:tc>
+        <w:tc>
+          <w:tcPr>
+            <w:tcW w:w="1539" w:type="dxa"/>
+            <w:vMerge w:val="restart"/>
+          </w:tcPr>
+          <w:p>
+            <w:pPr>
+              <w:pStyle w:val="TableParagraph"/>
+              <w:jc w:val="left"/>
+              <w:rPr>
+                <w:rFonts w:ascii="Times New Roman"/>
+                <w:sz w:val="16"/>
+              </w:rPr>
+            </w:pPr>
+          </w:p>
+        </w:tc>
+      </w:tr>
+      <w:tr>
+        <w:trPr>
+          <w:trHeight w:val="225"/>
+        </w:trPr>
+        <w:tc>
+          <w:tcPr>
+            <w:tcW w:w="401" w:type="dxa"/>
+            <w:vMerge/>
+            <w:tcBorders>
+              <w:top w:val="nil"/>
+            </w:tcBorders>
+          </w:tcPr>
+          <w:p>
+            <w:pPr>
+              <w:rPr>
+                <w:sz w:val="2"/>
+                <w:szCs w:val="2"/>
+              </w:rPr>
+            </w:pPr>
+          </w:p>
+        </w:tc>
+        <w:tc>
+          <w:tcPr>
+            <w:tcW w:w="1303" w:type="dxa"/>
+            <w:vMerge/>
+            <w:tcBorders>
+              <w:top w:val="nil"/>
+            </w:tcBorders>
+          </w:tcPr>
+          <w:p>
+            <w:pPr>
+              <w:rPr>
+                <w:sz w:val="2"/>
+                <w:szCs w:val="2"/>
+              </w:rPr>
+            </w:pPr>
+          </w:p>
+        </w:tc>
+        <w:tc>
+          <w:tcPr>
+            <w:tcW w:w="2693" w:type="dxa"/>
+          </w:tcPr>
+          <w:p>
+            <w:pPr>
+              <w:pStyle w:val="TableParagraph"/>
+              <w:spacing w:before="20"/>
+              <w:ind w:left="69"/>
+              <w:jc w:val="left"/>
+              <w:rPr>
+                <w:sz w:val="16"/>
+              </w:rPr>
+            </w:pPr>
+            <w:r>
+              <w:rPr>
+                <w:sz w:val="16"/>
+              </w:rPr>
+              <w:t>HABILIDADES</w:t>
+            </w:r>
+            <w:r>
+              <w:rPr>
+                <w:spacing w:val="-11"/>
+                <w:sz w:val="16"/>
+              </w:rPr>
+              <w:t xml:space="preserve"> </w:t>
+            </w:r>
+            <w:r>
+              <w:rPr>
+                <w:spacing w:val="-2"/>
+                <w:sz w:val="16"/>
+              </w:rPr>
+              <w:t>GERENCIALES</w:t>
+            </w:r>
+          </w:p>
+        </w:tc>
+        <w:tc>
+          <w:tcPr>
+            <w:tcW w:w="859" w:type="dxa"/>
+          </w:tcPr>
+          <w:p>
+            <w:pPr>
+              <w:pStyle w:val="TableParagraph"/>
+              <w:spacing w:before="20"/>
+              <w:ind w:left="13" w:right="4"/>
+              <w:rPr>
+                <w:sz w:val="16"/>
+              </w:rPr>
+            </w:pPr>
+            <w:r>
+              <w:rPr>
+                <w:spacing w:val="-10"/>
+                <w:sz w:val="16"/>
+              </w:rPr>
+              <w:t>3</w:t>
+            </w:r>
+          </w:p>
+        </w:tc>
+        <w:tc>
+          <w:tcPr>
+            <w:tcW w:w="657" w:type="dxa"/>
+          </w:tcPr>
+          <w:p>
+            <w:pPr>
+              <w:pStyle w:val="TableParagraph"/>
+              <w:jc w:val="left"/>
+              <w:rPr>
+                <w:rFonts w:ascii="Times New Roman"/>
+                <w:sz w:val="16"/>
+              </w:rPr>
+            </w:pPr>
+          </w:p>
+        </w:tc>
+        <w:tc>
+          <w:tcPr>
+            <w:tcW w:w="2309" w:type="dxa"/>
+          </w:tcPr>
+          <w:p>
+            <w:pPr>
+              <w:pStyle w:val="TableParagraph"/>
+              <w:jc w:val="left"/>
+              <w:rPr>
+                <w:rFonts w:ascii="Times New Roman"/>
+                <w:sz w:val="16"/>
+              </w:rPr>
+            </w:pPr>
+          </w:p>
+        </w:tc>
+        <w:tc>
+          <w:tcPr>
+            <w:tcW w:w="919" w:type="dxa"/>
+          </w:tcPr>
+          <w:p>
+            <w:pPr>
+              <w:pStyle w:val="TableParagraph"/>
+              <w:jc w:val="left"/>
+              <w:rPr>
+                <w:rFonts w:ascii="Times New Roman"/>
+                <w:sz w:val="16"/>
+              </w:rPr>
+            </w:pPr>
+          </w:p>
+        </w:tc>
+        <w:tc>
+          <w:tcPr>
+            <w:tcW w:w="1539" w:type="dxa"/>
+            <w:vMerge/>
+            <w:tcBorders>
+              <w:top w:val="nil"/>
+            </w:tcBorders>
+          </w:tcPr>
+          <w:p>
+            <w:pPr>
+              <w:rPr>
+                <w:sz w:val="2"/>
+                <w:szCs w:val="2"/>
+              </w:rPr>
+            </w:pPr>
+          </w:p>
+        </w:tc>
+      </w:tr>
+      <w:tr>
+        <w:trPr>
+          <w:trHeight w:val="450"/>
+        </w:trPr>
+        <w:tc>
+          <w:tcPr>
+            <w:tcW w:w="401" w:type="dxa"/>
+            <w:vMerge/>
+            <w:tcBorders>
+              <w:top w:val="nil"/>
+            </w:tcBorders>
+          </w:tcPr>
+          <w:p>
+            <w:pPr>
+              <w:rPr>
+                <w:sz w:val="2"/>
+                <w:szCs w:val="2"/>
+              </w:rPr>
+            </w:pPr>
+          </w:p>
+        </w:tc>
+        <w:tc>
+          <w:tcPr>
+            <w:tcW w:w="1303" w:type="dxa"/>
+            <w:vMerge/>
+            <w:tcBorders>
+              <w:top w:val="nil"/>
+            </w:tcBorders>
+          </w:tcPr>
+          <w:p>
+            <w:pPr>
+              <w:rPr>
+                <w:sz w:val="2"/>
+                <w:szCs w:val="2"/>
+              </w:rPr>
+            </w:pPr>
+          </w:p>
+        </w:tc>
+        <w:tc>
+          <w:tcPr>
+            <w:tcW w:w="2693" w:type="dxa"/>
+          </w:tcPr>
+          <w:p>
+            <w:pPr>
+              <w:pStyle w:val="TableParagraph"/>
+              <w:spacing w:before="41"/>
+              <w:ind w:left="69" w:right="128"/>
+              <w:jc w:val="left"/>
+              <w:rPr>
+                <w:sz w:val="16"/>
+              </w:rPr>
+            </w:pPr>
+            <w:r>
+              <w:rPr>
+                <w:sz w:val="16"/>
+              </w:rPr>
+              <w:t>ADMINISTRACION</w:t>
+            </w:r>
+            <w:r>
+              <w:rPr>
+                <w:spacing w:val="-12"/>
+                <w:sz w:val="16"/>
+              </w:rPr>
+              <w:t xml:space="preserve"> </w:t>
+            </w:r>
+            <w:r>
+              <w:rPr>
+                <w:sz w:val="16"/>
+              </w:rPr>
+              <w:t>Y</w:t>
+            </w:r>
+            <w:r>
+              <w:rPr>
+                <w:spacing w:val="-11"/>
+                <w:sz w:val="16"/>
+              </w:rPr>
+              <w:t xml:space="preserve"> </w:t>
+            </w:r>
+            <w:r>
+              <w:rPr>
+                <w:sz w:val="16"/>
+              </w:rPr>
+              <w:t>CONTROL DE OPERACIONES</w:t>
+            </w:r>
+          </w:p>
+        </w:tc>
+        <w:tc>
+          <w:tcPr>
+            <w:tcW w:w="859" w:type="dxa"/>
+          </w:tcPr>
+          <w:p>
+            <w:pPr>
+              <w:pStyle w:val="TableParagraph"/>
+              <w:spacing w:before="133"/>
+              <w:ind w:left="13" w:right="4"/>
+              <w:rPr>
+                <w:sz w:val="16"/>
+              </w:rPr>
+            </w:pPr>
+            <w:r>
+              <w:rPr>
+                <w:spacing w:val="-10"/>
+                <w:sz w:val="16"/>
+              </w:rPr>
+              <w:t>4</w:t>
+            </w:r>
+          </w:p>
+        </w:tc>
+        <w:tc>
+          <w:tcPr>
+            <w:tcW w:w="657" w:type="dxa"/>
+          </w:tcPr>
+          <w:p>
+            <w:pPr>
+              <w:pStyle w:val="TableParagraph"/>
+              <w:jc w:val="left"/>
+              <w:rPr>
+                <w:rFonts w:ascii="Times New Roman"/>
+                <w:sz w:val="16"/>
+              </w:rPr>
+            </w:pPr>
+          </w:p>
+        </w:tc>
+        <w:tc>
+          <w:tcPr>
+            <w:tcW w:w="2309" w:type="dxa"/>
+          </w:tcPr>
+          <w:p>
+            <w:pPr>
+              <w:pStyle w:val="TableParagraph"/>
+              <w:jc w:val="left"/>
+              <w:rPr>
+                <w:rFonts w:ascii="Times New Roman"/>
+                <w:sz w:val="16"/>
+              </w:rPr>
+            </w:pPr>
+          </w:p>
+        </w:tc>
+        <w:tc>
+          <w:tcPr>
+            <w:tcW w:w="919" w:type="dxa"/>
+          </w:tcPr>
+          <w:p>
+            <w:pPr>
+              <w:pStyle w:val="TableParagraph"/>
+              <w:jc w:val="left"/>
+              <w:rPr>
+                <w:rFonts w:ascii="Times New Roman"/>
+                <w:sz w:val="16"/>
+              </w:rPr>
+            </w:pPr>
+          </w:p>
+        </w:tc>
+        <w:tc>
+          <w:tcPr>
+            <w:tcW w:w="1539" w:type="dxa"/>
+            <w:vMerge/>
+            <w:tcBorders>
+              <w:top w:val="nil"/>
+            </w:tcBorders>
+          </w:tcPr>
+          <w:p>
+            <w:pPr>
+              <w:rPr>
+                <w:sz w:val="2"/>
+                <w:szCs w:val="2"/>
+              </w:rPr>
+            </w:pPr>
+          </w:p>
+        </w:tc>
+      </w:tr>
+      <w:tr>
+        <w:trPr>
+          <w:trHeight w:val="225"/>
+        </w:trPr>
+        <w:tc>
+          <w:tcPr>
+            <w:tcW w:w="401" w:type="dxa"/>
+            <w:vMerge/>
+            <w:tcBorders>
+              <w:top w:val="nil"/>
+            </w:tcBorders>
+          </w:tcPr>
+          <w:p>
+            <w:pPr>
+              <w:rPr>
+                <w:sz w:val="2"/>
+                <w:szCs w:val="2"/>
+              </w:rPr>
+            </w:pPr>
+          </w:p>
+        </w:tc>
+        <w:tc>
+          <w:tcPr>
+            <w:tcW w:w="1303" w:type="dxa"/>
+            <w:vMerge w:val="restart"/>
+          </w:tcPr>
+          <w:p>
+            <w:pPr>
+              <w:pStyle w:val="TableParagraph"/>
+              <w:spacing w:before="183"/>
+              <w:ind w:left="300" w:right="172" w:hanging="118"/>
+              <w:jc w:val="left"/>
+              <w:rPr>
+                <w:sz w:val="16"/>
+              </w:rPr>
+            </w:pPr>
+            <w:r>
+              <w:rPr>
+                <w:spacing w:val="-2"/>
+                <w:sz w:val="16"/>
+              </w:rPr>
+              <w:t xml:space="preserve">Pensamiento </w:t>
+            </w:r>
+            <w:r>
+              <w:rPr>
+                <w:sz w:val="16"/>
+              </w:rPr>
+              <w:t xml:space="preserve">creativo e </w:t>
+            </w:r>
+            <w:r>
+              <w:rPr>
+                <w:spacing w:val="-2"/>
+                <w:sz w:val="16"/>
+              </w:rPr>
+              <w:t>innovador</w:t>
+            </w:r>
+          </w:p>
+        </w:tc>
+        <w:tc>
+          <w:tcPr>
+            <w:tcW w:w="2693" w:type="dxa"/>
+          </w:tcPr>
+          <w:p>
+            <w:pPr>
+              <w:pStyle w:val="TableParagraph"/>
+              <w:spacing w:before="20"/>
+              <w:ind w:left="69"/>
+              <w:jc w:val="left"/>
+              <w:rPr>
+                <w:sz w:val="16"/>
+              </w:rPr>
+            </w:pPr>
+            <w:r>
+              <w:rPr>
+                <w:spacing w:val="-2"/>
+                <w:sz w:val="16"/>
+              </w:rPr>
+              <w:t>MACROECONOMÍA</w:t>
+            </w:r>
+          </w:p>
+        </w:tc>
+        <w:tc>
+          <w:tcPr>
+            <w:tcW w:w="859" w:type="dxa"/>
+          </w:tcPr>
+          <w:p>
+            <w:pPr>
+              <w:pStyle w:val="TableParagraph"/>
+              <w:spacing w:before="20"/>
+              <w:ind w:left="13" w:right="4"/>
+              <w:rPr>
+                <w:sz w:val="16"/>
+              </w:rPr>
+            </w:pPr>
+            <w:r>
+              <w:rPr>
+                <w:spacing w:val="-10"/>
+                <w:sz w:val="16"/>
+              </w:rPr>
+              <w:t>4</w:t>
+            </w:r>
+          </w:p>
+        </w:tc>
+        <w:tc>
+          <w:tcPr>
+            <w:tcW w:w="657" w:type="dxa"/>
+          </w:tcPr>
+          <w:p>
+            <w:pPr>
+              <w:pStyle w:val="TableParagraph"/>
+              <w:jc w:val="left"/>
+              <w:rPr>
+                <w:rFonts w:ascii="Times New Roman"/>
+                <w:sz w:val="16"/>
+              </w:rPr>
+            </w:pPr>
+          </w:p>
+        </w:tc>
+        <w:tc>
+          <w:tcPr>
+            <w:tcW w:w="2309" w:type="dxa"/>
+          </w:tcPr>
+          <w:p>
+            <w:pPr>
+              <w:pStyle w:val="TableParagraph"/>
+              <w:jc w:val="left"/>
+              <w:rPr>
+                <w:rFonts w:ascii="Times New Roman"/>
+                <w:sz w:val="16"/>
+              </w:rPr>
+            </w:pPr>
+          </w:p>
+        </w:tc>
+        <w:tc>
+          <w:tcPr>
+            <w:tcW w:w="919" w:type="dxa"/>
+          </w:tcPr>
+          <w:p>
+            <w:pPr>
+              <w:pStyle w:val="TableParagraph"/>
+              <w:jc w:val="left"/>
+              <w:rPr>
+                <w:rFonts w:ascii="Times New Roman"/>
+                <w:sz w:val="16"/>
+              </w:rPr>
+            </w:pPr>
+          </w:p>
+        </w:tc>
+        <w:tc>
+          <w:tcPr>
+            <w:tcW w:w="1539" w:type="dxa"/>
+            <w:vMerge w:val="restart"/>
+          </w:tcPr>
+          <w:p>
+            <w:pPr>
+              <w:pStyle w:val="TableParagraph"/>
+              <w:jc w:val="left"/>
+              <w:rPr>
+                <w:rFonts w:ascii="Times New Roman"/>
+                <w:sz w:val="16"/>
+              </w:rPr>
+            </w:pPr>
+          </w:p>
+        </w:tc>
+      </w:tr>
+      <w:tr>
+        <w:trPr>
+          <w:trHeight w:val="449"/>
+        </w:trPr>
+        <w:tc>
+          <w:tcPr>
+            <w:tcW w:w="401" w:type="dxa"/>
+            <w:vMerge/>
+            <w:tcBorders>
+              <w:top w:val="nil"/>
+            </w:tcBorders>
+          </w:tcPr>
+          <w:p>
+            <w:pPr>
+              <w:rPr>
+                <w:sz w:val="2"/>
+                <w:szCs w:val="2"/>
+              </w:rPr>
+            </w:pPr>
+          </w:p>
+        </w:tc>
+        <w:tc>
+          <w:tcPr>
+            <w:tcW w:w="1303" w:type="dxa"/>
+            <w:vMerge/>
+            <w:tcBorders>
+              <w:top w:val="nil"/>
+            </w:tcBorders>
+          </w:tcPr>
+          <w:p>
+            <w:pPr>
+              <w:rPr>
+                <w:sz w:val="2"/>
+                <w:szCs w:val="2"/>
+              </w:rPr>
+            </w:pPr>
+          </w:p>
+        </w:tc>
+        <w:tc>
+          <w:tcPr>
+            <w:tcW w:w="2693" w:type="dxa"/>
+          </w:tcPr>
+          <w:p>
+            <w:pPr>
+              <w:pStyle w:val="TableParagraph"/>
+              <w:spacing w:before="39"/>
+              <w:ind w:left="69"/>
+              <w:jc w:val="left"/>
+              <w:rPr>
+                <w:sz w:val="16"/>
+              </w:rPr>
+            </w:pPr>
+            <w:r>
+              <w:rPr>
+                <w:sz w:val="16"/>
+              </w:rPr>
+              <w:t>DISEÑO</w:t>
+            </w:r>
+            <w:r>
+              <w:rPr>
+                <w:spacing w:val="-12"/>
+                <w:sz w:val="16"/>
+              </w:rPr>
+              <w:t xml:space="preserve"> </w:t>
+            </w:r>
+            <w:r>
+              <w:rPr>
+                <w:sz w:val="16"/>
+              </w:rPr>
+              <w:t>ORGANIZACIONAL</w:t>
+            </w:r>
+            <w:r>
+              <w:rPr>
+                <w:spacing w:val="-11"/>
+                <w:sz w:val="16"/>
+              </w:rPr>
+              <w:t xml:space="preserve"> </w:t>
+            </w:r>
+            <w:r>
+              <w:rPr>
+                <w:sz w:val="16"/>
+              </w:rPr>
+              <w:t>Y</w:t>
+            </w:r>
+            <w:r>
+              <w:rPr>
+                <w:spacing w:val="-11"/>
+                <w:sz w:val="16"/>
+              </w:rPr>
+              <w:t xml:space="preserve"> </w:t>
+            </w:r>
+            <w:r>
+              <w:rPr>
+                <w:sz w:val="16"/>
+              </w:rPr>
+              <w:t>DE PROCESOS II</w:t>
+            </w:r>
+          </w:p>
+        </w:tc>
+        <w:tc>
+          <w:tcPr>
+            <w:tcW w:w="859" w:type="dxa"/>
+          </w:tcPr>
+          <w:p>
+            <w:pPr>
+              <w:pStyle w:val="TableParagraph"/>
+              <w:spacing w:before="133"/>
+              <w:ind w:left="13" w:right="4"/>
+              <w:rPr>
+                <w:sz w:val="16"/>
+              </w:rPr>
+            </w:pPr>
+            <w:r>
+              <w:rPr>
+                <w:spacing w:val="-10"/>
+                <w:sz w:val="16"/>
+              </w:rPr>
+              <w:t>4</w:t>
+            </w:r>
+          </w:p>
+        </w:tc>
+        <w:tc>
+          <w:tcPr>
+            <w:tcW w:w="657" w:type="dxa"/>
+          </w:tcPr>
+          <w:p>
+            <w:pPr>
+              <w:pStyle w:val="TableParagraph"/>
+              <w:jc w:val="left"/>
+              <w:rPr>
+                <w:rFonts w:ascii="Times New Roman"/>
+                <w:sz w:val="16"/>
+              </w:rPr>
+            </w:pPr>
+          </w:p>
+        </w:tc>
+        <w:tc>
+          <w:tcPr>
+            <w:tcW w:w="2309" w:type="dxa"/>
+          </w:tcPr>
+          <w:p>
+            <w:pPr>
+              <w:pStyle w:val="TableParagraph"/>
+              <w:jc w:val="left"/>
+              <w:rPr>
+                <w:rFonts w:ascii="Times New Roman"/>
+                <w:sz w:val="16"/>
+              </w:rPr>
+            </w:pPr>
+          </w:p>
+        </w:tc>
+        <w:tc>
+          <w:tcPr>
+            <w:tcW w:w="919" w:type="dxa"/>
+          </w:tcPr>
+          <w:p>
+            <w:pPr>
+              <w:pStyle w:val="TableParagraph"/>
+              <w:jc w:val="left"/>
+              <w:rPr>
+                <w:rFonts w:ascii="Times New Roman"/>
+                <w:sz w:val="16"/>
+              </w:rPr>
+            </w:pPr>
+          </w:p>
+        </w:tc>
+        <w:tc>
+          <w:tcPr>
+            <w:tcW w:w="1539" w:type="dxa"/>
+            <w:vMerge/>
+            <w:tcBorders>
+              <w:top w:val="nil"/>
+            </w:tcBorders>
+          </w:tcPr>
+          <w:p>
+            <w:pPr>
+              <w:rPr>
+                <w:sz w:val="2"/>
+                <w:szCs w:val="2"/>
+              </w:rPr>
+            </w:pPr>
+          </w:p>
+        </w:tc>
+      </w:tr>
+      <w:tr>
+        <w:trPr>
+          <w:trHeight w:val="225"/>
+        </w:trPr>
+        <w:tc>
+          <w:tcPr>
+            <w:tcW w:w="401" w:type="dxa"/>
+            <w:vMerge/>
+            <w:tcBorders>
+              <w:top w:val="nil"/>
+            </w:tcBorders>
+          </w:tcPr>
+          <w:p>
+            <w:pPr>
+              <w:rPr>
+                <w:sz w:val="2"/>
+                <w:szCs w:val="2"/>
+              </w:rPr>
+            </w:pPr>
+          </w:p>
+        </w:tc>
+        <w:tc>
+          <w:tcPr>
+            <w:tcW w:w="1303" w:type="dxa"/>
+            <w:vMerge/>
+            <w:tcBorders>
+              <w:top w:val="nil"/>
+            </w:tcBorders>
+          </w:tcPr>
+          <w:p>
+            <w:pPr>
+              <w:rPr>
+                <w:sz w:val="2"/>
+                <w:szCs w:val="2"/>
+              </w:rPr>
+            </w:pPr>
+          </w:p>
+        </w:tc>
+        <w:tc>
+          <w:tcPr>
+            <w:tcW w:w="2693" w:type="dxa"/>
+          </w:tcPr>
+          <w:p>
+            <w:pPr>
+              <w:pStyle w:val="TableParagraph"/>
+              <w:spacing w:before="22" w:line="183" w:lineRule="exact"/>
+              <w:ind w:left="69"/>
+              <w:jc w:val="left"/>
+              <w:rPr>
+                <w:sz w:val="16"/>
+              </w:rPr>
+            </w:pPr>
+            <w:r>
+              <w:rPr>
+                <w:spacing w:val="-2"/>
+                <w:sz w:val="16"/>
+              </w:rPr>
+              <w:t>MICROECONOMÍA</w:t>
+            </w:r>
+          </w:p>
+        </w:tc>
+        <w:tc>
+          <w:tcPr>
+            <w:tcW w:w="859" w:type="dxa"/>
+          </w:tcPr>
+          <w:p>
+            <w:pPr>
+              <w:pStyle w:val="TableParagraph"/>
+              <w:spacing w:before="22" w:line="183" w:lineRule="exact"/>
+              <w:ind w:left="13" w:right="4"/>
+              <w:rPr>
+                <w:sz w:val="16"/>
+              </w:rPr>
+            </w:pPr>
+            <w:r>
+              <w:rPr>
+                <w:spacing w:val="-10"/>
+                <w:sz w:val="16"/>
+              </w:rPr>
+              <w:t>4</w:t>
+            </w:r>
+          </w:p>
+        </w:tc>
+        <w:tc>
+          <w:tcPr>
+            <w:tcW w:w="657" w:type="dxa"/>
+          </w:tcPr>
+          <w:p>
+            <w:pPr>
+              <w:pStyle w:val="TableParagraph"/>
+              <w:jc w:val="left"/>
+              <w:rPr>
+                <w:rFonts w:ascii="Times New Roman"/>
+                <w:sz w:val="16"/>
+              </w:rPr>
+            </w:pPr>
+          </w:p>
+        </w:tc>
+        <w:tc>
+          <w:tcPr>
+            <w:tcW w:w="2309" w:type="dxa"/>
+          </w:tcPr>
+          <w:p>
+            <w:pPr>
+              <w:pStyle w:val="TableParagraph"/>
+              <w:jc w:val="left"/>
+              <w:rPr>
+                <w:rFonts w:ascii="Times New Roman"/>
+                <w:sz w:val="16"/>
+              </w:rPr>
+            </w:pPr>
+          </w:p>
+        </w:tc>
+        <w:tc>
+          <w:tcPr>
+            <w:tcW w:w="919" w:type="dxa"/>
+          </w:tcPr>
+          <w:p>
+            <w:pPr>
+              <w:pStyle w:val="TableParagraph"/>
+              <w:jc w:val="left"/>
+              <w:rPr>
+                <w:rFonts w:ascii="Times New Roman"/>
+                <w:sz w:val="16"/>
+              </w:rPr>
+            </w:pPr>
+          </w:p>
+        </w:tc>
+        <w:tc>
+          <w:tcPr>
+            <w:tcW w:w="1539" w:type="dxa"/>
+            <w:vMerge/>
+            <w:tcBorders>
+              <w:top w:val="nil"/>
+            </w:tcBorders>
+          </w:tcPr>
+          <w:p>
+            <w:pPr>
+              <w:rPr>
+                <w:sz w:val="2"/>
+                <w:szCs w:val="2"/>
+              </w:rPr>
+            </w:pPr>
+          </w:p>
+        </w:tc>
+      </w:tr>
+      <w:tr>
+        <w:trPr>
+          <w:trHeight w:val="369"/>
+        </w:trPr>
+        <w:tc>
+          <w:tcPr>
+            <w:tcW w:w="1704" w:type="dxa"/>
+            <w:gridSpan w:val="2"/>
+            <w:tcBorders>
+              <w:left w:val="nil"/>
+              <w:bottom w:val="nil"/>
+            </w:tcBorders>
+          </w:tcPr>
+          <w:p>
+            <w:pPr>
+              <w:pStyle w:val="TableParagraph"/>
+              <w:jc w:val="left"/>
+              <w:rPr>
+                <w:rFonts w:ascii="Times New Roman"/>
+                <w:sz w:val="16"/>
+              </w:rPr>
+            </w:pPr>
+          </w:p>
+        </w:tc>
+        <w:tc>
+          <w:tcPr>
+            <w:tcW w:w="2693" w:type="dxa"/>
+            <w:shd w:val="clear" w:color="auto" w:fill="D9D9D9"/>
+          </w:tcPr>
+          <w:p>
+            <w:pPr>
+              <w:pStyle w:val="TableParagraph"/>
+              <w:spacing w:line="180" w:lineRule="atLeast"/>
+              <w:ind w:left="69"/>
+              <w:jc w:val="left"/>
+              <w:rPr>
+                <w:rFonts w:ascii="Arial"/>
+                <w:b/>
+                <w:sz w:val="16"/>
+              </w:rPr>
+            </w:pPr>
+            <w:proofErr w:type="gramStart"/>
+            <w:r>
+              <w:rPr>
+                <w:rFonts w:ascii="Arial"/>
+                <w:b/>
+                <w:sz w:val="16"/>
+              </w:rPr>
+              <w:t>TOTAL</w:t>
+            </w:r>
+            <w:proofErr w:type="gramEnd"/>
+            <w:r>
+              <w:rPr>
+                <w:rFonts w:ascii="Arial"/>
+                <w:b/>
+                <w:spacing w:val="-12"/>
+                <w:sz w:val="16"/>
+              </w:rPr>
+              <w:t xml:space="preserve"> </w:t>
+            </w:r>
+            <w:r>
+              <w:rPr>
+                <w:rFonts w:ascii="Arial"/>
+                <w:b/>
+                <w:sz w:val="16"/>
+              </w:rPr>
+              <w:t>DE</w:t>
+            </w:r>
+            <w:r>
+              <w:rPr>
+                <w:rFonts w:ascii="Arial"/>
+                <w:b/>
+                <w:spacing w:val="-11"/>
+                <w:sz w:val="16"/>
+              </w:rPr>
+              <w:t xml:space="preserve"> </w:t>
+            </w:r>
+            <w:r>
+              <w:rPr>
+                <w:rFonts w:ascii="Arial"/>
+                <w:b/>
+                <w:sz w:val="16"/>
+              </w:rPr>
+              <w:t>CREDITOS</w:t>
+            </w:r>
+            <w:r>
+              <w:rPr>
+                <w:rFonts w:ascii="Arial"/>
+                <w:b/>
+                <w:spacing w:val="-11"/>
+                <w:sz w:val="16"/>
+              </w:rPr>
+              <w:t xml:space="preserve"> </w:t>
+            </w:r>
+            <w:r>
+              <w:rPr>
+                <w:rFonts w:ascii="Arial"/>
+                <w:b/>
+                <w:sz w:val="16"/>
+              </w:rPr>
+              <w:t xml:space="preserve">A </w:t>
+            </w:r>
+            <w:r>
+              <w:rPr>
+                <w:rFonts w:ascii="Arial"/>
+                <w:b/>
+                <w:spacing w:val="-2"/>
+                <w:sz w:val="16"/>
+              </w:rPr>
+              <w:t>CONVALIDAR</w:t>
+            </w:r>
+          </w:p>
+        </w:tc>
+        <w:tc>
+          <w:tcPr>
+            <w:tcW w:w="859" w:type="dxa"/>
+            <w:shd w:val="clear" w:color="auto" w:fill="D9D9D9"/>
+          </w:tcPr>
+          <w:p>
+            <w:pPr>
+              <w:pStyle w:val="TableParagraph"/>
+              <w:spacing w:before="92"/>
+              <w:ind w:left="13" w:right="2"/>
+              <w:rPr>
+                <w:rFonts w:ascii="Arial"/>
+                <w:b/>
+                <w:sz w:val="16"/>
+              </w:rPr>
+            </w:pPr>
+            <w:r>
+              <w:rPr>
+                <w:rFonts w:ascii="Arial"/>
+                <w:b/>
+                <w:spacing w:val="-5"/>
+                <w:sz w:val="16"/>
+              </w:rPr>
+              <w:t>80</w:t>
+            </w:r>
+          </w:p>
+        </w:tc>
+        <w:tc>
+          <w:tcPr>
+            <w:tcW w:w="5424" w:type="dxa"/>
+            <w:gridSpan w:val="4"/>
+            <w:tcBorders>
+              <w:bottom w:val="nil"/>
+              <w:right w:val="nil"/>
+            </w:tcBorders>
+          </w:tcPr>
+          <w:p>
+            <w:pPr>
+              <w:pStyle w:val="TableParagraph"/>
+              <w:jc w:val="left"/>
+              <w:rPr>
+                <w:rFonts w:ascii="Times New Roman"/>
+                <w:sz w:val="16"/>
+              </w:rPr>
+            </w:pPr>
+          </w:p>
+        </w:tc>
+      </w:tr>
     </w:tbl>
-    <w:p>
-      <w:pPr>
-        <w:rPr>
-          <w:sz w:val="2"/>
-          <w:szCs w:val="2"/>
-        </w:rPr>
-        <w:sectPr>
-          <w:headerReference w:type="default" r:id="rId6"/>
-          <w:footerReference w:type="default" r:id="rId7"/>
-          <w:type w:val="continuous"/>
-          <w:pgSz w:w="11920" w:h="16850"/>
-          <w:pgMar w:top="2080" w:right="425" w:bottom="580" w:left="708" w:header="754" w:footer="392" w:gutter="0"/>
-          <w:pgNumType w:start="1"/>
-          <w:cols w:space="720"/>
-        </w:sectPr>
-      </w:pPr>
-    </w:p>
     <w:p>
       <w:pPr>
         <w:pStyle w:val="Textoindependiente"/>
@@ -4976,1608 +6534,6 @@
         </w:rPr>
       </w:pPr>
     </w:p>
-    <w:tbl>
-      <w:tblPr>
-        <w:tblStyle w:val="TableNormal"/>
-        <w:tblW w:w="0" w:type="auto"/>
-        <w:tblInd w:w="26" w:type="dxa"/>
-        <w:tblBorders>
-          <w:top w:val="single" w:sz="4" w:space="0" w:color="000000"/>
-          <w:left w:val="single" w:sz="4" w:space="0" w:color="000000"/>
-          <w:bottom w:val="single" w:sz="4" w:space="0" w:color="000000"/>
-          <w:right w:val="single" w:sz="4" w:space="0" w:color="000000"/>
-          <w:insideH w:val="single" w:sz="4" w:space="0" w:color="000000"/>
-          <w:insideV w:val="single" w:sz="4" w:space="0" w:color="000000"/>
-        </w:tblBorders>
-        <w:tblLayout w:type="fixed"/>
-        <w:tblLook w:val="01E0" w:firstRow="1" w:lastRow="1" w:firstColumn="1" w:lastColumn="1" w:noHBand="0" w:noVBand="0"/>
-      </w:tblPr>
-      <w:tblGrid>
-        <w:gridCol w:w="401"/>
-        <w:gridCol w:w="1303"/>
-        <w:gridCol w:w="2693"/>
-        <w:gridCol w:w="859"/>
-        <w:gridCol w:w="657"/>
-        <w:gridCol w:w="2309"/>
-        <w:gridCol w:w="919"/>
-        <w:gridCol w:w="1539"/>
-      </w:tblGrid>
-      <w:tr>
-        <w:trPr>
-          <w:trHeight w:val="366"/>
-        </w:trPr>
-        <w:tc>
-          <w:tcPr>
-            <w:tcW w:w="401" w:type="dxa"/>
-            <w:vMerge w:val="restart"/>
-            <w:tcBorders>
-              <w:top w:val="nil"/>
-            </w:tcBorders>
-          </w:tcPr>
-          <w:p>
-            <w:pPr>
-              <w:pStyle w:val="TableParagraph"/>
-              <w:jc w:val="left"/>
-              <w:rPr>
-                <w:rFonts w:ascii="Times New Roman"/>
-                <w:sz w:val="16"/>
-              </w:rPr>
-            </w:pPr>
-          </w:p>
-        </w:tc>
-        <w:tc>
-          <w:tcPr>
-            <w:tcW w:w="1303" w:type="dxa"/>
-            <w:vMerge w:val="restart"/>
-            <w:tcBorders>
-              <w:top w:val="nil"/>
-            </w:tcBorders>
-          </w:tcPr>
-          <w:p>
-            <w:pPr>
-              <w:pStyle w:val="TableParagraph"/>
-              <w:jc w:val="left"/>
-              <w:rPr>
-                <w:rFonts w:ascii="Times New Roman"/>
-                <w:sz w:val="16"/>
-              </w:rPr>
-            </w:pPr>
-          </w:p>
-        </w:tc>
-        <w:tc>
-          <w:tcPr>
-            <w:tcW w:w="2693" w:type="dxa"/>
-            <w:tcBorders>
-              <w:top w:val="nil"/>
-            </w:tcBorders>
-          </w:tcPr>
-          <w:p>
-            <w:pPr>
-              <w:pStyle w:val="TableParagraph"/>
-              <w:spacing w:line="182" w:lineRule="exact"/>
-              <w:ind w:left="69"/>
-              <w:jc w:val="left"/>
-              <w:rPr>
-                <w:sz w:val="16"/>
-              </w:rPr>
-            </w:pPr>
-            <w:r>
-              <w:rPr>
-                <w:sz w:val="16"/>
-              </w:rPr>
-              <w:t>FUNDAMENTOS</w:t>
-            </w:r>
-            <w:r>
-              <w:rPr>
-                <w:spacing w:val="-12"/>
-                <w:sz w:val="16"/>
-              </w:rPr>
-              <w:t xml:space="preserve"> </w:t>
-            </w:r>
-            <w:r>
-              <w:rPr>
-                <w:sz w:val="16"/>
-              </w:rPr>
-              <w:t>DE</w:t>
-            </w:r>
-            <w:r>
-              <w:rPr>
-                <w:spacing w:val="-11"/>
-                <w:sz w:val="16"/>
-              </w:rPr>
-              <w:t xml:space="preserve"> </w:t>
-            </w:r>
-            <w:r>
-              <w:rPr>
-                <w:sz w:val="16"/>
-              </w:rPr>
-              <w:t xml:space="preserve">LA </w:t>
-            </w:r>
-            <w:r>
-              <w:rPr>
-                <w:spacing w:val="-2"/>
-                <w:sz w:val="16"/>
-              </w:rPr>
-              <w:t>ADMINISTRACIÓN</w:t>
-            </w:r>
-          </w:p>
-        </w:tc>
-        <w:tc>
-          <w:tcPr>
-            <w:tcW w:w="859" w:type="dxa"/>
-            <w:tcBorders>
-              <w:top w:val="nil"/>
-            </w:tcBorders>
-          </w:tcPr>
-          <w:p>
-            <w:pPr>
-              <w:pStyle w:val="TableParagraph"/>
-              <w:spacing w:before="92"/>
-              <w:ind w:left="13" w:right="4"/>
-              <w:rPr>
-                <w:sz w:val="16"/>
-              </w:rPr>
-            </w:pPr>
-            <w:r>
-              <w:rPr>
-                <w:spacing w:val="-10"/>
-                <w:sz w:val="16"/>
-              </w:rPr>
-              <w:t>3</w:t>
-            </w:r>
-          </w:p>
-        </w:tc>
-        <w:tc>
-          <w:tcPr>
-            <w:tcW w:w="657" w:type="dxa"/>
-            <w:tcBorders>
-              <w:top w:val="nil"/>
-            </w:tcBorders>
-          </w:tcPr>
-          <w:p>
-            <w:pPr>
-              <w:pStyle w:val="TableParagraph"/>
-              <w:jc w:val="left"/>
-              <w:rPr>
-                <w:rFonts w:ascii="Times New Roman"/>
-                <w:sz w:val="16"/>
-              </w:rPr>
-            </w:pPr>
-          </w:p>
-        </w:tc>
-        <w:tc>
-          <w:tcPr>
-            <w:tcW w:w="2309" w:type="dxa"/>
-            <w:tcBorders>
-              <w:top w:val="nil"/>
-            </w:tcBorders>
-          </w:tcPr>
-          <w:p>
-            <w:pPr>
-              <w:pStyle w:val="TableParagraph"/>
-              <w:jc w:val="left"/>
-              <w:rPr>
-                <w:rFonts w:ascii="Times New Roman"/>
-                <w:sz w:val="16"/>
-              </w:rPr>
-            </w:pPr>
-          </w:p>
-        </w:tc>
-        <w:tc>
-          <w:tcPr>
-            <w:tcW w:w="919" w:type="dxa"/>
-            <w:tcBorders>
-              <w:top w:val="nil"/>
-            </w:tcBorders>
-          </w:tcPr>
-          <w:p>
-            <w:pPr>
-              <w:pStyle w:val="TableParagraph"/>
-              <w:jc w:val="left"/>
-              <w:rPr>
-                <w:rFonts w:ascii="Times New Roman"/>
-                <w:sz w:val="16"/>
-              </w:rPr>
-            </w:pPr>
-          </w:p>
-        </w:tc>
-        <w:tc>
-          <w:tcPr>
-            <w:tcW w:w="1539" w:type="dxa"/>
-            <w:vMerge w:val="restart"/>
-            <w:tcBorders>
-              <w:top w:val="nil"/>
-            </w:tcBorders>
-          </w:tcPr>
-          <w:p>
-            <w:pPr>
-              <w:pStyle w:val="TableParagraph"/>
-              <w:jc w:val="left"/>
-              <w:rPr>
-                <w:rFonts w:ascii="Times New Roman"/>
-                <w:sz w:val="16"/>
-              </w:rPr>
-            </w:pPr>
-          </w:p>
-        </w:tc>
-      </w:tr>
-      <w:tr>
-        <w:trPr>
-          <w:trHeight w:val="225"/>
-        </w:trPr>
-        <w:tc>
-          <w:tcPr>
-            <w:tcW w:w="401" w:type="dxa"/>
-            <w:vMerge/>
-            <w:tcBorders>
-              <w:top w:val="nil"/>
-            </w:tcBorders>
-          </w:tcPr>
-          <w:p>
-            <w:pPr>
-              <w:rPr>
-                <w:sz w:val="2"/>
-                <w:szCs w:val="2"/>
-              </w:rPr>
-            </w:pPr>
-          </w:p>
-        </w:tc>
-        <w:tc>
-          <w:tcPr>
-            <w:tcW w:w="1303" w:type="dxa"/>
-            <w:vMerge/>
-            <w:tcBorders>
-              <w:top w:val="nil"/>
-            </w:tcBorders>
-          </w:tcPr>
-          <w:p>
-            <w:pPr>
-              <w:rPr>
-                <w:sz w:val="2"/>
-                <w:szCs w:val="2"/>
-              </w:rPr>
-            </w:pPr>
-          </w:p>
-        </w:tc>
-        <w:tc>
-          <w:tcPr>
-            <w:tcW w:w="2693" w:type="dxa"/>
-          </w:tcPr>
-          <w:p>
-            <w:pPr>
-              <w:pStyle w:val="TableParagraph"/>
-              <w:spacing w:before="22" w:line="183" w:lineRule="exact"/>
-              <w:ind w:left="69"/>
-              <w:jc w:val="left"/>
-              <w:rPr>
-                <w:sz w:val="16"/>
-              </w:rPr>
-            </w:pPr>
-            <w:r>
-              <w:rPr>
-                <w:sz w:val="16"/>
-              </w:rPr>
-              <w:t>GESTIÓN</w:t>
-            </w:r>
-            <w:r>
-              <w:rPr>
-                <w:spacing w:val="-6"/>
-                <w:sz w:val="16"/>
-              </w:rPr>
-              <w:t xml:space="preserve"> </w:t>
-            </w:r>
-            <w:r>
-              <w:rPr>
-                <w:spacing w:val="-2"/>
-                <w:sz w:val="16"/>
-              </w:rPr>
-              <w:t>ESTRATÉGICA</w:t>
-            </w:r>
-          </w:p>
-        </w:tc>
-        <w:tc>
-          <w:tcPr>
-            <w:tcW w:w="859" w:type="dxa"/>
-          </w:tcPr>
-          <w:p>
-            <w:pPr>
-              <w:pStyle w:val="TableParagraph"/>
-              <w:spacing w:before="22" w:line="183" w:lineRule="exact"/>
-              <w:ind w:left="13" w:right="4"/>
-              <w:rPr>
-                <w:sz w:val="16"/>
-              </w:rPr>
-            </w:pPr>
-            <w:r>
-              <w:rPr>
-                <w:spacing w:val="-10"/>
-                <w:sz w:val="16"/>
-              </w:rPr>
-              <w:t>4</w:t>
-            </w:r>
-          </w:p>
-        </w:tc>
-        <w:tc>
-          <w:tcPr>
-            <w:tcW w:w="657" w:type="dxa"/>
-          </w:tcPr>
-          <w:p>
-            <w:pPr>
-              <w:pStyle w:val="TableParagraph"/>
-              <w:jc w:val="left"/>
-              <w:rPr>
-                <w:rFonts w:ascii="Times New Roman"/>
-                <w:sz w:val="16"/>
-              </w:rPr>
-            </w:pPr>
-          </w:p>
-        </w:tc>
-        <w:tc>
-          <w:tcPr>
-            <w:tcW w:w="2309" w:type="dxa"/>
-          </w:tcPr>
-          <w:p>
-            <w:pPr>
-              <w:pStyle w:val="TableParagraph"/>
-              <w:jc w:val="left"/>
-              <w:rPr>
-                <w:rFonts w:ascii="Times New Roman"/>
-                <w:sz w:val="16"/>
-              </w:rPr>
-            </w:pPr>
-          </w:p>
-        </w:tc>
-        <w:tc>
-          <w:tcPr>
-            <w:tcW w:w="919" w:type="dxa"/>
-          </w:tcPr>
-          <w:p>
-            <w:pPr>
-              <w:pStyle w:val="TableParagraph"/>
-              <w:jc w:val="left"/>
-              <w:rPr>
-                <w:rFonts w:ascii="Times New Roman"/>
-                <w:sz w:val="16"/>
-              </w:rPr>
-            </w:pPr>
-          </w:p>
-        </w:tc>
-        <w:tc>
-          <w:tcPr>
-            <w:tcW w:w="1539" w:type="dxa"/>
-            <w:vMerge/>
-            <w:tcBorders>
-              <w:top w:val="nil"/>
-            </w:tcBorders>
-          </w:tcPr>
-          <w:p>
-            <w:pPr>
-              <w:rPr>
-                <w:sz w:val="2"/>
-                <w:szCs w:val="2"/>
-              </w:rPr>
-            </w:pPr>
-          </w:p>
-        </w:tc>
-      </w:tr>
-      <w:tr>
-        <w:trPr>
-          <w:trHeight w:val="450"/>
-        </w:trPr>
-        <w:tc>
-          <w:tcPr>
-            <w:tcW w:w="401" w:type="dxa"/>
-            <w:vMerge/>
-            <w:tcBorders>
-              <w:top w:val="nil"/>
-            </w:tcBorders>
-          </w:tcPr>
-          <w:p>
-            <w:pPr>
-              <w:rPr>
-                <w:sz w:val="2"/>
-                <w:szCs w:val="2"/>
-              </w:rPr>
-            </w:pPr>
-          </w:p>
-        </w:tc>
-        <w:tc>
-          <w:tcPr>
-            <w:tcW w:w="1303" w:type="dxa"/>
-            <w:vMerge w:val="restart"/>
-          </w:tcPr>
-          <w:p>
-            <w:pPr>
-              <w:pStyle w:val="TableParagraph"/>
-              <w:spacing w:before="9"/>
-              <w:jc w:val="left"/>
-              <w:rPr>
-                <w:rFonts w:ascii="Calibri Light"/>
-                <w:sz w:val="16"/>
-              </w:rPr>
-            </w:pPr>
-          </w:p>
-          <w:p>
-            <w:pPr>
-              <w:pStyle w:val="TableParagraph"/>
-              <w:ind w:left="81" w:right="69" w:hanging="1"/>
-              <w:rPr>
-                <w:sz w:val="16"/>
-              </w:rPr>
-            </w:pPr>
-            <w:r>
-              <w:rPr>
-                <w:spacing w:val="-2"/>
-                <w:sz w:val="16"/>
-              </w:rPr>
-              <w:t xml:space="preserve">Compromiso </w:t>
-            </w:r>
-            <w:r>
-              <w:rPr>
-                <w:sz w:val="16"/>
-              </w:rPr>
-              <w:t>con principios, valores y</w:t>
-            </w:r>
-            <w:r>
-              <w:rPr>
-                <w:spacing w:val="40"/>
-                <w:sz w:val="16"/>
-              </w:rPr>
-              <w:t xml:space="preserve"> </w:t>
-            </w:r>
-            <w:r>
-              <w:rPr>
-                <w:sz w:val="16"/>
-              </w:rPr>
-              <w:t>mejora</w:t>
-            </w:r>
-            <w:r>
-              <w:rPr>
-                <w:spacing w:val="-12"/>
-                <w:sz w:val="16"/>
-              </w:rPr>
-              <w:t xml:space="preserve"> </w:t>
-            </w:r>
-            <w:r>
-              <w:rPr>
-                <w:sz w:val="16"/>
-              </w:rPr>
-              <w:t>continua</w:t>
-            </w:r>
-          </w:p>
-        </w:tc>
-        <w:tc>
-          <w:tcPr>
-            <w:tcW w:w="2693" w:type="dxa"/>
-          </w:tcPr>
-          <w:p>
-            <w:pPr>
-              <w:pStyle w:val="TableParagraph"/>
-              <w:spacing w:before="41"/>
-              <w:ind w:left="69"/>
-              <w:jc w:val="left"/>
-              <w:rPr>
-                <w:sz w:val="16"/>
-              </w:rPr>
-            </w:pPr>
-            <w:r>
-              <w:rPr>
-                <w:sz w:val="16"/>
-              </w:rPr>
-              <w:t>DISEÑO</w:t>
-            </w:r>
-            <w:r>
-              <w:rPr>
-                <w:spacing w:val="-12"/>
-                <w:sz w:val="16"/>
-              </w:rPr>
-              <w:t xml:space="preserve"> </w:t>
-            </w:r>
-            <w:r>
-              <w:rPr>
-                <w:sz w:val="16"/>
-              </w:rPr>
-              <w:t>ORGANIZACIONAL</w:t>
-            </w:r>
-            <w:r>
-              <w:rPr>
-                <w:spacing w:val="-11"/>
-                <w:sz w:val="16"/>
-              </w:rPr>
-              <w:t xml:space="preserve"> </w:t>
-            </w:r>
-            <w:r>
-              <w:rPr>
-                <w:sz w:val="16"/>
-              </w:rPr>
-              <w:t>Y</w:t>
-            </w:r>
-            <w:r>
-              <w:rPr>
-                <w:spacing w:val="-11"/>
-                <w:sz w:val="16"/>
-              </w:rPr>
-              <w:t xml:space="preserve"> </w:t>
-            </w:r>
-            <w:r>
-              <w:rPr>
-                <w:sz w:val="16"/>
-              </w:rPr>
-              <w:t>DE PROCESOS I</w:t>
-            </w:r>
-          </w:p>
-        </w:tc>
-        <w:tc>
-          <w:tcPr>
-            <w:tcW w:w="859" w:type="dxa"/>
-          </w:tcPr>
-          <w:p>
-            <w:pPr>
-              <w:pStyle w:val="TableParagraph"/>
-              <w:spacing w:before="135"/>
-              <w:ind w:left="13" w:right="4"/>
-              <w:rPr>
-                <w:sz w:val="16"/>
-              </w:rPr>
-            </w:pPr>
-            <w:r>
-              <w:rPr>
-                <w:spacing w:val="-10"/>
-                <w:sz w:val="16"/>
-              </w:rPr>
-              <w:t>5</w:t>
-            </w:r>
-          </w:p>
-        </w:tc>
-        <w:tc>
-          <w:tcPr>
-            <w:tcW w:w="657" w:type="dxa"/>
-          </w:tcPr>
-          <w:p>
-            <w:pPr>
-              <w:pStyle w:val="TableParagraph"/>
-              <w:jc w:val="left"/>
-              <w:rPr>
-                <w:rFonts w:ascii="Times New Roman"/>
-                <w:sz w:val="16"/>
-              </w:rPr>
-            </w:pPr>
-          </w:p>
-        </w:tc>
-        <w:tc>
-          <w:tcPr>
-            <w:tcW w:w="2309" w:type="dxa"/>
-          </w:tcPr>
-          <w:p>
-            <w:pPr>
-              <w:pStyle w:val="TableParagraph"/>
-              <w:jc w:val="left"/>
-              <w:rPr>
-                <w:rFonts w:ascii="Times New Roman"/>
-                <w:sz w:val="16"/>
-              </w:rPr>
-            </w:pPr>
-          </w:p>
-        </w:tc>
-        <w:tc>
-          <w:tcPr>
-            <w:tcW w:w="919" w:type="dxa"/>
-          </w:tcPr>
-          <w:p>
-            <w:pPr>
-              <w:pStyle w:val="TableParagraph"/>
-              <w:jc w:val="left"/>
-              <w:rPr>
-                <w:rFonts w:ascii="Times New Roman"/>
-                <w:sz w:val="16"/>
-              </w:rPr>
-            </w:pPr>
-          </w:p>
-        </w:tc>
-        <w:tc>
-          <w:tcPr>
-            <w:tcW w:w="1539" w:type="dxa"/>
-            <w:vMerge w:val="restart"/>
-          </w:tcPr>
-          <w:p>
-            <w:pPr>
-              <w:pStyle w:val="TableParagraph"/>
-              <w:jc w:val="left"/>
-              <w:rPr>
-                <w:rFonts w:ascii="Times New Roman"/>
-                <w:sz w:val="16"/>
-              </w:rPr>
-            </w:pPr>
-          </w:p>
-        </w:tc>
-      </w:tr>
-      <w:tr>
-        <w:trPr>
-          <w:trHeight w:val="225"/>
-        </w:trPr>
-        <w:tc>
-          <w:tcPr>
-            <w:tcW w:w="401" w:type="dxa"/>
-            <w:vMerge/>
-            <w:tcBorders>
-              <w:top w:val="nil"/>
-            </w:tcBorders>
-          </w:tcPr>
-          <w:p>
-            <w:pPr>
-              <w:rPr>
-                <w:sz w:val="2"/>
-                <w:szCs w:val="2"/>
-              </w:rPr>
-            </w:pPr>
-          </w:p>
-        </w:tc>
-        <w:tc>
-          <w:tcPr>
-            <w:tcW w:w="1303" w:type="dxa"/>
-            <w:vMerge/>
-            <w:tcBorders>
-              <w:top w:val="nil"/>
-            </w:tcBorders>
-          </w:tcPr>
-          <w:p>
-            <w:pPr>
-              <w:rPr>
-                <w:sz w:val="2"/>
-                <w:szCs w:val="2"/>
-              </w:rPr>
-            </w:pPr>
-          </w:p>
-        </w:tc>
-        <w:tc>
-          <w:tcPr>
-            <w:tcW w:w="2693" w:type="dxa"/>
-          </w:tcPr>
-          <w:p>
-            <w:pPr>
-              <w:pStyle w:val="TableParagraph"/>
-              <w:spacing w:before="20"/>
-              <w:ind w:left="69"/>
-              <w:jc w:val="left"/>
-              <w:rPr>
-                <w:sz w:val="16"/>
-              </w:rPr>
-            </w:pPr>
-            <w:r>
-              <w:rPr>
-                <w:sz w:val="16"/>
-              </w:rPr>
-              <w:t>HABILIDADES</w:t>
-            </w:r>
-            <w:r>
-              <w:rPr>
-                <w:spacing w:val="-11"/>
-                <w:sz w:val="16"/>
-              </w:rPr>
-              <w:t xml:space="preserve"> </w:t>
-            </w:r>
-            <w:r>
-              <w:rPr>
-                <w:spacing w:val="-2"/>
-                <w:sz w:val="16"/>
-              </w:rPr>
-              <w:t>GERENCIALES</w:t>
-            </w:r>
-          </w:p>
-        </w:tc>
-        <w:tc>
-          <w:tcPr>
-            <w:tcW w:w="859" w:type="dxa"/>
-          </w:tcPr>
-          <w:p>
-            <w:pPr>
-              <w:pStyle w:val="TableParagraph"/>
-              <w:spacing w:before="20"/>
-              <w:ind w:left="13" w:right="4"/>
-              <w:rPr>
-                <w:sz w:val="16"/>
-              </w:rPr>
-            </w:pPr>
-            <w:r>
-              <w:rPr>
-                <w:spacing w:val="-10"/>
-                <w:sz w:val="16"/>
-              </w:rPr>
-              <w:t>3</w:t>
-            </w:r>
-          </w:p>
-        </w:tc>
-        <w:tc>
-          <w:tcPr>
-            <w:tcW w:w="657" w:type="dxa"/>
-          </w:tcPr>
-          <w:p>
-            <w:pPr>
-              <w:pStyle w:val="TableParagraph"/>
-              <w:jc w:val="left"/>
-              <w:rPr>
-                <w:rFonts w:ascii="Times New Roman"/>
-                <w:sz w:val="16"/>
-              </w:rPr>
-            </w:pPr>
-          </w:p>
-        </w:tc>
-        <w:tc>
-          <w:tcPr>
-            <w:tcW w:w="2309" w:type="dxa"/>
-          </w:tcPr>
-          <w:p>
-            <w:pPr>
-              <w:pStyle w:val="TableParagraph"/>
-              <w:jc w:val="left"/>
-              <w:rPr>
-                <w:rFonts w:ascii="Times New Roman"/>
-                <w:sz w:val="16"/>
-              </w:rPr>
-            </w:pPr>
-          </w:p>
-        </w:tc>
-        <w:tc>
-          <w:tcPr>
-            <w:tcW w:w="919" w:type="dxa"/>
-          </w:tcPr>
-          <w:p>
-            <w:pPr>
-              <w:pStyle w:val="TableParagraph"/>
-              <w:jc w:val="left"/>
-              <w:rPr>
-                <w:rFonts w:ascii="Times New Roman"/>
-                <w:sz w:val="16"/>
-              </w:rPr>
-            </w:pPr>
-          </w:p>
-        </w:tc>
-        <w:tc>
-          <w:tcPr>
-            <w:tcW w:w="1539" w:type="dxa"/>
-            <w:vMerge/>
-            <w:tcBorders>
-              <w:top w:val="nil"/>
-            </w:tcBorders>
-          </w:tcPr>
-          <w:p>
-            <w:pPr>
-              <w:rPr>
-                <w:sz w:val="2"/>
-                <w:szCs w:val="2"/>
-              </w:rPr>
-            </w:pPr>
-          </w:p>
-        </w:tc>
-      </w:tr>
-      <w:tr>
-        <w:trPr>
-          <w:trHeight w:val="450"/>
-        </w:trPr>
-        <w:tc>
-          <w:tcPr>
-            <w:tcW w:w="401" w:type="dxa"/>
-            <w:vMerge/>
-            <w:tcBorders>
-              <w:top w:val="nil"/>
-            </w:tcBorders>
-          </w:tcPr>
-          <w:p>
-            <w:pPr>
-              <w:rPr>
-                <w:sz w:val="2"/>
-                <w:szCs w:val="2"/>
-              </w:rPr>
-            </w:pPr>
-          </w:p>
-        </w:tc>
-        <w:tc>
-          <w:tcPr>
-            <w:tcW w:w="1303" w:type="dxa"/>
-            <w:vMerge/>
-            <w:tcBorders>
-              <w:top w:val="nil"/>
-            </w:tcBorders>
-          </w:tcPr>
-          <w:p>
-            <w:pPr>
-              <w:rPr>
-                <w:sz w:val="2"/>
-                <w:szCs w:val="2"/>
-              </w:rPr>
-            </w:pPr>
-          </w:p>
-        </w:tc>
-        <w:tc>
-          <w:tcPr>
-            <w:tcW w:w="2693" w:type="dxa"/>
-          </w:tcPr>
-          <w:p>
-            <w:pPr>
-              <w:pStyle w:val="TableParagraph"/>
-              <w:spacing w:before="41"/>
-              <w:ind w:left="69" w:right="128"/>
-              <w:jc w:val="left"/>
-              <w:rPr>
-                <w:sz w:val="16"/>
-              </w:rPr>
-            </w:pPr>
-            <w:r>
-              <w:rPr>
-                <w:sz w:val="16"/>
-              </w:rPr>
-              <w:t>ADMINISTRACION</w:t>
-            </w:r>
-            <w:r>
-              <w:rPr>
-                <w:spacing w:val="-12"/>
-                <w:sz w:val="16"/>
-              </w:rPr>
-              <w:t xml:space="preserve"> </w:t>
-            </w:r>
-            <w:r>
-              <w:rPr>
-                <w:sz w:val="16"/>
-              </w:rPr>
-              <w:t>Y</w:t>
-            </w:r>
-            <w:r>
-              <w:rPr>
-                <w:spacing w:val="-11"/>
-                <w:sz w:val="16"/>
-              </w:rPr>
-              <w:t xml:space="preserve"> </w:t>
-            </w:r>
-            <w:r>
-              <w:rPr>
-                <w:sz w:val="16"/>
-              </w:rPr>
-              <w:t>CONTROL DE OPERACIONES</w:t>
-            </w:r>
-          </w:p>
-        </w:tc>
-        <w:tc>
-          <w:tcPr>
-            <w:tcW w:w="859" w:type="dxa"/>
-          </w:tcPr>
-          <w:p>
-            <w:pPr>
-              <w:pStyle w:val="TableParagraph"/>
-              <w:spacing w:before="133"/>
-              <w:ind w:left="13" w:right="4"/>
-              <w:rPr>
-                <w:sz w:val="16"/>
-              </w:rPr>
-            </w:pPr>
-            <w:r>
-              <w:rPr>
-                <w:spacing w:val="-10"/>
-                <w:sz w:val="16"/>
-              </w:rPr>
-              <w:t>4</w:t>
-            </w:r>
-          </w:p>
-        </w:tc>
-        <w:tc>
-          <w:tcPr>
-            <w:tcW w:w="657" w:type="dxa"/>
-          </w:tcPr>
-          <w:p>
-            <w:pPr>
-              <w:pStyle w:val="TableParagraph"/>
-              <w:jc w:val="left"/>
-              <w:rPr>
-                <w:rFonts w:ascii="Times New Roman"/>
-                <w:sz w:val="16"/>
-              </w:rPr>
-            </w:pPr>
-          </w:p>
-        </w:tc>
-        <w:tc>
-          <w:tcPr>
-            <w:tcW w:w="2309" w:type="dxa"/>
-          </w:tcPr>
-          <w:p>
-            <w:pPr>
-              <w:pStyle w:val="TableParagraph"/>
-              <w:jc w:val="left"/>
-              <w:rPr>
-                <w:rFonts w:ascii="Times New Roman"/>
-                <w:sz w:val="16"/>
-              </w:rPr>
-            </w:pPr>
-          </w:p>
-        </w:tc>
-        <w:tc>
-          <w:tcPr>
-            <w:tcW w:w="919" w:type="dxa"/>
-          </w:tcPr>
-          <w:p>
-            <w:pPr>
-              <w:pStyle w:val="TableParagraph"/>
-              <w:jc w:val="left"/>
-              <w:rPr>
-                <w:rFonts w:ascii="Times New Roman"/>
-                <w:sz w:val="16"/>
-              </w:rPr>
-            </w:pPr>
-          </w:p>
-        </w:tc>
-        <w:tc>
-          <w:tcPr>
-            <w:tcW w:w="1539" w:type="dxa"/>
-            <w:vMerge/>
-            <w:tcBorders>
-              <w:top w:val="nil"/>
-            </w:tcBorders>
-          </w:tcPr>
-          <w:p>
-            <w:pPr>
-              <w:rPr>
-                <w:sz w:val="2"/>
-                <w:szCs w:val="2"/>
-              </w:rPr>
-            </w:pPr>
-          </w:p>
-        </w:tc>
-      </w:tr>
-      <w:tr>
-        <w:trPr>
-          <w:trHeight w:val="225"/>
-        </w:trPr>
-        <w:tc>
-          <w:tcPr>
-            <w:tcW w:w="401" w:type="dxa"/>
-            <w:vMerge/>
-            <w:tcBorders>
-              <w:top w:val="nil"/>
-            </w:tcBorders>
-          </w:tcPr>
-          <w:p>
-            <w:pPr>
-              <w:rPr>
-                <w:sz w:val="2"/>
-                <w:szCs w:val="2"/>
-              </w:rPr>
-            </w:pPr>
-          </w:p>
-        </w:tc>
-        <w:tc>
-          <w:tcPr>
-            <w:tcW w:w="1303" w:type="dxa"/>
-            <w:vMerge w:val="restart"/>
-          </w:tcPr>
-          <w:p>
-            <w:pPr>
-              <w:pStyle w:val="TableParagraph"/>
-              <w:spacing w:before="183"/>
-              <w:ind w:left="300" w:right="172" w:hanging="118"/>
-              <w:jc w:val="left"/>
-              <w:rPr>
-                <w:sz w:val="16"/>
-              </w:rPr>
-            </w:pPr>
-            <w:r>
-              <w:rPr>
-                <w:spacing w:val="-2"/>
-                <w:sz w:val="16"/>
-              </w:rPr>
-              <w:t xml:space="preserve">Pensamiento </w:t>
-            </w:r>
-            <w:r>
-              <w:rPr>
-                <w:sz w:val="16"/>
-              </w:rPr>
-              <w:t xml:space="preserve">creativo e </w:t>
-            </w:r>
-            <w:r>
-              <w:rPr>
-                <w:spacing w:val="-2"/>
-                <w:sz w:val="16"/>
-              </w:rPr>
-              <w:t>innovador</w:t>
-            </w:r>
-          </w:p>
-        </w:tc>
-        <w:tc>
-          <w:tcPr>
-            <w:tcW w:w="2693" w:type="dxa"/>
-          </w:tcPr>
-          <w:p>
-            <w:pPr>
-              <w:pStyle w:val="TableParagraph"/>
-              <w:spacing w:before="20"/>
-              <w:ind w:left="69"/>
-              <w:jc w:val="left"/>
-              <w:rPr>
-                <w:sz w:val="16"/>
-              </w:rPr>
-            </w:pPr>
-            <w:r>
-              <w:rPr>
-                <w:spacing w:val="-2"/>
-                <w:sz w:val="16"/>
-              </w:rPr>
-              <w:t>MACROECONOMÍA</w:t>
-            </w:r>
-          </w:p>
-        </w:tc>
-        <w:tc>
-          <w:tcPr>
-            <w:tcW w:w="859" w:type="dxa"/>
-          </w:tcPr>
-          <w:p>
-            <w:pPr>
-              <w:pStyle w:val="TableParagraph"/>
-              <w:spacing w:before="20"/>
-              <w:ind w:left="13" w:right="4"/>
-              <w:rPr>
-                <w:sz w:val="16"/>
-              </w:rPr>
-            </w:pPr>
-            <w:r>
-              <w:rPr>
-                <w:spacing w:val="-10"/>
-                <w:sz w:val="16"/>
-              </w:rPr>
-              <w:t>4</w:t>
-            </w:r>
-          </w:p>
-        </w:tc>
-        <w:tc>
-          <w:tcPr>
-            <w:tcW w:w="657" w:type="dxa"/>
-          </w:tcPr>
-          <w:p>
-            <w:pPr>
-              <w:pStyle w:val="TableParagraph"/>
-              <w:jc w:val="left"/>
-              <w:rPr>
-                <w:rFonts w:ascii="Times New Roman"/>
-                <w:sz w:val="16"/>
-              </w:rPr>
-            </w:pPr>
-          </w:p>
-        </w:tc>
-        <w:tc>
-          <w:tcPr>
-            <w:tcW w:w="2309" w:type="dxa"/>
-          </w:tcPr>
-          <w:p>
-            <w:pPr>
-              <w:pStyle w:val="TableParagraph"/>
-              <w:jc w:val="left"/>
-              <w:rPr>
-                <w:rFonts w:ascii="Times New Roman"/>
-                <w:sz w:val="16"/>
-              </w:rPr>
-            </w:pPr>
-          </w:p>
-        </w:tc>
-        <w:tc>
-          <w:tcPr>
-            <w:tcW w:w="919" w:type="dxa"/>
-          </w:tcPr>
-          <w:p>
-            <w:pPr>
-              <w:pStyle w:val="TableParagraph"/>
-              <w:jc w:val="left"/>
-              <w:rPr>
-                <w:rFonts w:ascii="Times New Roman"/>
-                <w:sz w:val="16"/>
-              </w:rPr>
-            </w:pPr>
-          </w:p>
-        </w:tc>
-        <w:tc>
-          <w:tcPr>
-            <w:tcW w:w="1539" w:type="dxa"/>
-            <w:vMerge w:val="restart"/>
-          </w:tcPr>
-          <w:p>
-            <w:pPr>
-              <w:pStyle w:val="TableParagraph"/>
-              <w:jc w:val="left"/>
-              <w:rPr>
-                <w:rFonts w:ascii="Times New Roman"/>
-                <w:sz w:val="16"/>
-              </w:rPr>
-            </w:pPr>
-          </w:p>
-        </w:tc>
-      </w:tr>
-      <w:tr>
-        <w:trPr>
-          <w:trHeight w:val="449"/>
-        </w:trPr>
-        <w:tc>
-          <w:tcPr>
-            <w:tcW w:w="401" w:type="dxa"/>
-            <w:vMerge/>
-            <w:tcBorders>
-              <w:top w:val="nil"/>
-            </w:tcBorders>
-          </w:tcPr>
-          <w:p>
-            <w:pPr>
-              <w:rPr>
-                <w:sz w:val="2"/>
-                <w:szCs w:val="2"/>
-              </w:rPr>
-            </w:pPr>
-          </w:p>
-        </w:tc>
-        <w:tc>
-          <w:tcPr>
-            <w:tcW w:w="1303" w:type="dxa"/>
-            <w:vMerge/>
-            <w:tcBorders>
-              <w:top w:val="nil"/>
-            </w:tcBorders>
-          </w:tcPr>
-          <w:p>
-            <w:pPr>
-              <w:rPr>
-                <w:sz w:val="2"/>
-                <w:szCs w:val="2"/>
-              </w:rPr>
-            </w:pPr>
-          </w:p>
-        </w:tc>
-        <w:tc>
-          <w:tcPr>
-            <w:tcW w:w="2693" w:type="dxa"/>
-          </w:tcPr>
-          <w:p>
-            <w:pPr>
-              <w:pStyle w:val="TableParagraph"/>
-              <w:spacing w:before="39"/>
-              <w:ind w:left="69"/>
-              <w:jc w:val="left"/>
-              <w:rPr>
-                <w:sz w:val="16"/>
-              </w:rPr>
-            </w:pPr>
-            <w:r>
-              <w:rPr>
-                <w:sz w:val="16"/>
-              </w:rPr>
-              <w:t>DISEÑO</w:t>
-            </w:r>
-            <w:r>
-              <w:rPr>
-                <w:spacing w:val="-12"/>
-                <w:sz w:val="16"/>
-              </w:rPr>
-              <w:t xml:space="preserve"> </w:t>
-            </w:r>
-            <w:r>
-              <w:rPr>
-                <w:sz w:val="16"/>
-              </w:rPr>
-              <w:t>ORGANIZACIONAL</w:t>
-            </w:r>
-            <w:r>
-              <w:rPr>
-                <w:spacing w:val="-11"/>
-                <w:sz w:val="16"/>
-              </w:rPr>
-              <w:t xml:space="preserve"> </w:t>
-            </w:r>
-            <w:r>
-              <w:rPr>
-                <w:sz w:val="16"/>
-              </w:rPr>
-              <w:t>Y</w:t>
-            </w:r>
-            <w:r>
-              <w:rPr>
-                <w:spacing w:val="-11"/>
-                <w:sz w:val="16"/>
-              </w:rPr>
-              <w:t xml:space="preserve"> </w:t>
-            </w:r>
-            <w:r>
-              <w:rPr>
-                <w:sz w:val="16"/>
-              </w:rPr>
-              <w:t>DE PROCESOS II</w:t>
-            </w:r>
-          </w:p>
-        </w:tc>
-        <w:tc>
-          <w:tcPr>
-            <w:tcW w:w="859" w:type="dxa"/>
-          </w:tcPr>
-          <w:p>
-            <w:pPr>
-              <w:pStyle w:val="TableParagraph"/>
-              <w:spacing w:before="133"/>
-              <w:ind w:left="13" w:right="4"/>
-              <w:rPr>
-                <w:sz w:val="16"/>
-              </w:rPr>
-            </w:pPr>
-            <w:r>
-              <w:rPr>
-                <w:spacing w:val="-10"/>
-                <w:sz w:val="16"/>
-              </w:rPr>
-              <w:t>4</w:t>
-            </w:r>
-          </w:p>
-        </w:tc>
-        <w:tc>
-          <w:tcPr>
-            <w:tcW w:w="657" w:type="dxa"/>
-          </w:tcPr>
-          <w:p>
-            <w:pPr>
-              <w:pStyle w:val="TableParagraph"/>
-              <w:jc w:val="left"/>
-              <w:rPr>
-                <w:rFonts w:ascii="Times New Roman"/>
-                <w:sz w:val="16"/>
-              </w:rPr>
-            </w:pPr>
-          </w:p>
-        </w:tc>
-        <w:tc>
-          <w:tcPr>
-            <w:tcW w:w="2309" w:type="dxa"/>
-          </w:tcPr>
-          <w:p>
-            <w:pPr>
-              <w:pStyle w:val="TableParagraph"/>
-              <w:jc w:val="left"/>
-              <w:rPr>
-                <w:rFonts w:ascii="Times New Roman"/>
-                <w:sz w:val="16"/>
-              </w:rPr>
-            </w:pPr>
-          </w:p>
-        </w:tc>
-        <w:tc>
-          <w:tcPr>
-            <w:tcW w:w="919" w:type="dxa"/>
-          </w:tcPr>
-          <w:p>
-            <w:pPr>
-              <w:pStyle w:val="TableParagraph"/>
-              <w:jc w:val="left"/>
-              <w:rPr>
-                <w:rFonts w:ascii="Times New Roman"/>
-                <w:sz w:val="16"/>
-              </w:rPr>
-            </w:pPr>
-          </w:p>
-        </w:tc>
-        <w:tc>
-          <w:tcPr>
-            <w:tcW w:w="1539" w:type="dxa"/>
-            <w:vMerge/>
-            <w:tcBorders>
-              <w:top w:val="nil"/>
-            </w:tcBorders>
-          </w:tcPr>
-          <w:p>
-            <w:pPr>
-              <w:rPr>
-                <w:sz w:val="2"/>
-                <w:szCs w:val="2"/>
-              </w:rPr>
-            </w:pPr>
-          </w:p>
-        </w:tc>
-      </w:tr>
-      <w:tr>
-        <w:trPr>
-          <w:trHeight w:val="225"/>
-        </w:trPr>
-        <w:tc>
-          <w:tcPr>
-            <w:tcW w:w="401" w:type="dxa"/>
-            <w:vMerge/>
-            <w:tcBorders>
-              <w:top w:val="nil"/>
-            </w:tcBorders>
-          </w:tcPr>
-          <w:p>
-            <w:pPr>
-              <w:rPr>
-                <w:sz w:val="2"/>
-                <w:szCs w:val="2"/>
-              </w:rPr>
-            </w:pPr>
-          </w:p>
-        </w:tc>
-        <w:tc>
-          <w:tcPr>
-            <w:tcW w:w="1303" w:type="dxa"/>
-            <w:vMerge/>
-            <w:tcBorders>
-              <w:top w:val="nil"/>
-            </w:tcBorders>
-          </w:tcPr>
-          <w:p>
-            <w:pPr>
-              <w:rPr>
-                <w:sz w:val="2"/>
-                <w:szCs w:val="2"/>
-              </w:rPr>
-            </w:pPr>
-          </w:p>
-        </w:tc>
-        <w:tc>
-          <w:tcPr>
-            <w:tcW w:w="2693" w:type="dxa"/>
-          </w:tcPr>
-          <w:p>
-            <w:pPr>
-              <w:pStyle w:val="TableParagraph"/>
-              <w:spacing w:before="22" w:line="183" w:lineRule="exact"/>
-              <w:ind w:left="69"/>
-              <w:jc w:val="left"/>
-              <w:rPr>
-                <w:sz w:val="16"/>
-              </w:rPr>
-            </w:pPr>
-            <w:r>
-              <w:rPr>
-                <w:spacing w:val="-2"/>
-                <w:sz w:val="16"/>
-              </w:rPr>
-              <w:t>MICROECONOMÍA</w:t>
-            </w:r>
-          </w:p>
-        </w:tc>
-        <w:tc>
-          <w:tcPr>
-            <w:tcW w:w="859" w:type="dxa"/>
-          </w:tcPr>
-          <w:p>
-            <w:pPr>
-              <w:pStyle w:val="TableParagraph"/>
-              <w:spacing w:before="22" w:line="183" w:lineRule="exact"/>
-              <w:ind w:left="13" w:right="4"/>
-              <w:rPr>
-                <w:sz w:val="16"/>
-              </w:rPr>
-            </w:pPr>
-            <w:r>
-              <w:rPr>
-                <w:spacing w:val="-10"/>
-                <w:sz w:val="16"/>
-              </w:rPr>
-              <w:t>4</w:t>
-            </w:r>
-          </w:p>
-        </w:tc>
-        <w:tc>
-          <w:tcPr>
-            <w:tcW w:w="657" w:type="dxa"/>
-          </w:tcPr>
-          <w:p>
-            <w:pPr>
-              <w:pStyle w:val="TableParagraph"/>
-              <w:jc w:val="left"/>
-              <w:rPr>
-                <w:rFonts w:ascii="Times New Roman"/>
-                <w:sz w:val="16"/>
-              </w:rPr>
-            </w:pPr>
-          </w:p>
-        </w:tc>
-        <w:tc>
-          <w:tcPr>
-            <w:tcW w:w="2309" w:type="dxa"/>
-          </w:tcPr>
-          <w:p>
-            <w:pPr>
-              <w:pStyle w:val="TableParagraph"/>
-              <w:jc w:val="left"/>
-              <w:rPr>
-                <w:rFonts w:ascii="Times New Roman"/>
-                <w:sz w:val="16"/>
-              </w:rPr>
-            </w:pPr>
-          </w:p>
-        </w:tc>
-        <w:tc>
-          <w:tcPr>
-            <w:tcW w:w="919" w:type="dxa"/>
-          </w:tcPr>
-          <w:p>
-            <w:pPr>
-              <w:pStyle w:val="TableParagraph"/>
-              <w:jc w:val="left"/>
-              <w:rPr>
-                <w:rFonts w:ascii="Times New Roman"/>
-                <w:sz w:val="16"/>
-              </w:rPr>
-            </w:pPr>
-          </w:p>
-        </w:tc>
-        <w:tc>
-          <w:tcPr>
-            <w:tcW w:w="1539" w:type="dxa"/>
-            <w:vMerge/>
-            <w:tcBorders>
-              <w:top w:val="nil"/>
-            </w:tcBorders>
-          </w:tcPr>
-          <w:p>
-            <w:pPr>
-              <w:rPr>
-                <w:sz w:val="2"/>
-                <w:szCs w:val="2"/>
-              </w:rPr>
-            </w:pPr>
-          </w:p>
-        </w:tc>
-      </w:tr>
-      <w:tr>
-        <w:trPr>
-          <w:trHeight w:val="369"/>
-        </w:trPr>
-        <w:tc>
-          <w:tcPr>
-            <w:tcW w:w="1704" w:type="dxa"/>
-            <w:gridSpan w:val="2"/>
-            <w:tcBorders>
-              <w:left w:val="nil"/>
-              <w:bottom w:val="nil"/>
-            </w:tcBorders>
-          </w:tcPr>
-          <w:p>
-            <w:pPr>
-              <w:pStyle w:val="TableParagraph"/>
-              <w:jc w:val="left"/>
-              <w:rPr>
-                <w:rFonts w:ascii="Times New Roman"/>
-                <w:sz w:val="16"/>
-              </w:rPr>
-            </w:pPr>
-          </w:p>
-        </w:tc>
-        <w:tc>
-          <w:tcPr>
-            <w:tcW w:w="2693" w:type="dxa"/>
-            <w:shd w:val="clear" w:color="auto" w:fill="D9D9D9"/>
-          </w:tcPr>
-          <w:p>
-            <w:pPr>
-              <w:pStyle w:val="TableParagraph"/>
-              <w:spacing w:line="180" w:lineRule="atLeast"/>
-              <w:ind w:left="69"/>
-              <w:jc w:val="left"/>
-              <w:rPr>
-                <w:rFonts w:ascii="Arial"/>
-                <w:b/>
-                <w:sz w:val="16"/>
-              </w:rPr>
-            </w:pPr>
-            <w:proofErr w:type="gramStart"/>
-            <w:r>
-              <w:rPr>
-                <w:rFonts w:ascii="Arial"/>
-                <w:b/>
-                <w:sz w:val="16"/>
-              </w:rPr>
-              <w:t>TOTAL</w:t>
-            </w:r>
-            <w:proofErr w:type="gramEnd"/>
-            <w:r>
-              <w:rPr>
-                <w:rFonts w:ascii="Arial"/>
-                <w:b/>
-                <w:spacing w:val="-12"/>
-                <w:sz w:val="16"/>
-              </w:rPr>
-              <w:t xml:space="preserve"> </w:t>
-            </w:r>
-            <w:r>
-              <w:rPr>
-                <w:rFonts w:ascii="Arial"/>
-                <w:b/>
-                <w:sz w:val="16"/>
-              </w:rPr>
-              <w:t>DE</w:t>
-            </w:r>
-            <w:r>
-              <w:rPr>
-                <w:rFonts w:ascii="Arial"/>
-                <w:b/>
-                <w:spacing w:val="-11"/>
-                <w:sz w:val="16"/>
-              </w:rPr>
-              <w:t xml:space="preserve"> </w:t>
-            </w:r>
-            <w:r>
-              <w:rPr>
-                <w:rFonts w:ascii="Arial"/>
-                <w:b/>
-                <w:sz w:val="16"/>
-              </w:rPr>
-              <w:t>CREDITOS</w:t>
-            </w:r>
-            <w:r>
-              <w:rPr>
-                <w:rFonts w:ascii="Arial"/>
-                <w:b/>
-                <w:spacing w:val="-11"/>
-                <w:sz w:val="16"/>
-              </w:rPr>
-              <w:t xml:space="preserve"> </w:t>
-            </w:r>
-            <w:r>
-              <w:rPr>
-                <w:rFonts w:ascii="Arial"/>
-                <w:b/>
-                <w:sz w:val="16"/>
-              </w:rPr>
-              <w:t xml:space="preserve">A </w:t>
-            </w:r>
-            <w:r>
-              <w:rPr>
-                <w:rFonts w:ascii="Arial"/>
-                <w:b/>
-                <w:spacing w:val="-2"/>
-                <w:sz w:val="16"/>
-              </w:rPr>
-              <w:t>CONVALIDAR</w:t>
-            </w:r>
-          </w:p>
-        </w:tc>
-        <w:tc>
-          <w:tcPr>
-            <w:tcW w:w="859" w:type="dxa"/>
-            <w:shd w:val="clear" w:color="auto" w:fill="D9D9D9"/>
-          </w:tcPr>
-          <w:p>
-            <w:pPr>
-              <w:pStyle w:val="TableParagraph"/>
-              <w:spacing w:before="92"/>
-              <w:ind w:left="13" w:right="2"/>
-              <w:rPr>
-                <w:rFonts w:ascii="Arial"/>
-                <w:b/>
-                <w:sz w:val="16"/>
-              </w:rPr>
-            </w:pPr>
-            <w:r>
-              <w:rPr>
-                <w:rFonts w:ascii="Arial"/>
-                <w:b/>
-                <w:spacing w:val="-5"/>
-                <w:sz w:val="16"/>
-              </w:rPr>
-              <w:t>80</w:t>
-            </w:r>
-          </w:p>
-        </w:tc>
-        <w:tc>
-          <w:tcPr>
-            <w:tcW w:w="5424" w:type="dxa"/>
-            <w:gridSpan w:val="4"/>
-            <w:tcBorders>
-              <w:bottom w:val="nil"/>
-              <w:right w:val="nil"/>
-            </w:tcBorders>
-          </w:tcPr>
-          <w:p>
-            <w:pPr>
-              <w:pStyle w:val="TableParagraph"/>
-              <w:jc w:val="left"/>
-              <w:rPr>
-                <w:rFonts w:ascii="Times New Roman"/>
-                <w:sz w:val="16"/>
-              </w:rPr>
-            </w:pPr>
-          </w:p>
-        </w:tc>
-      </w:tr>
-    </w:tbl>
     <w:p>
       <w:pPr>
         <w:pStyle w:val="Textoindependiente"/>

</xml_diff>